<commit_message>
Stop tracking runtime logs and cache files
</commit_message>
<xml_diff>
--- a/docs/BI Platform Architecture.docx
+++ b/docs/BI Platform Architecture.docx
@@ -7179,10 +7179,10 @@
             <v:path o:extrusionok="f" gradientshapeok="t" o:connecttype="rect"/>
             <o:lock v:ext="edit" aspectratio="t"/>
           </v:shapetype>
-          <v:shape id="_x0000_i1053" type="#_x0000_t75" style="width:75pt;height:49.5pt" o:ole="">
+          <v:shape id="_x0000_i1059" type="#_x0000_t75" style="width:75pt;height:49.5pt" o:ole="">
             <v:imagedata r:id="rId7" o:title=""/>
           </v:shape>
-          <o:OLEObject Type="Embed" ProgID="Package" ShapeID="_x0000_i1053" DrawAspect="Icon" ObjectID="_1835635129" r:id="rId8"/>
+          <o:OLEObject Type="Embed" ProgID="Package" ShapeID="_x0000_i1059" DrawAspect="Icon" ObjectID="_1835705874" r:id="rId8"/>
         </w:object>
       </w:r>
     </w:p>
@@ -7217,7 +7217,7 @@
           <v:shape id="_x0000_i1045" type="#_x0000_t75" style="width:75pt;height:49.5pt" o:ole="">
             <v:imagedata r:id="rId9" o:title=""/>
           </v:shape>
-          <o:OLEObject Type="Embed" ProgID="Package" ShapeID="_x0000_i1045" DrawAspect="Icon" ObjectID="_1835635130" r:id="rId10"/>
+          <o:OLEObject Type="Embed" ProgID="Package" ShapeID="_x0000_i1045" DrawAspect="Icon" ObjectID="_1835705875" r:id="rId10"/>
         </w:object>
       </w:r>
     </w:p>
@@ -7252,7 +7252,7 @@
           <v:shape id="_x0000_i1040" type="#_x0000_t75" style="width:75pt;height:49.5pt" o:ole="">
             <v:imagedata r:id="rId11" o:title=""/>
           </v:shape>
-          <o:OLEObject Type="Embed" ProgID="Package" ShapeID="_x0000_i1040" DrawAspect="Icon" ObjectID="_1835635131" r:id="rId12"/>
+          <o:OLEObject Type="Embed" ProgID="Package" ShapeID="_x0000_i1040" DrawAspect="Icon" ObjectID="_1835705876" r:id="rId12"/>
         </w:object>
       </w:r>
     </w:p>
@@ -7287,7 +7287,7 @@
           <v:shape id="_x0000_i1041" type="#_x0000_t75" style="width:75pt;height:49.5pt" o:ole="">
             <v:imagedata r:id="rId13" o:title=""/>
           </v:shape>
-          <o:OLEObject Type="Embed" ProgID="Package" ShapeID="_x0000_i1041" DrawAspect="Icon" ObjectID="_1835635132" r:id="rId14"/>
+          <o:OLEObject Type="Embed" ProgID="Package" ShapeID="_x0000_i1041" DrawAspect="Icon" ObjectID="_1835705877" r:id="rId14"/>
         </w:object>
       </w:r>
     </w:p>
@@ -7355,11 +7355,11 @@
           <w:rFonts w:ascii="Calibri" w:hAnsi="Calibri" w:cs="Calibri"/>
           <w:lang w:val="en-CA" w:bidi="fa-IR"/>
         </w:rPr>
-        <w:object w:dxaOrig="1502" w:dyaOrig="984" w14:anchorId="764A1593">
-          <v:shape id="_x0000_i1046" type="#_x0000_t75" style="width:75pt;height:49.5pt" o:ole="">
+        <w:object w:dxaOrig="1502" w:dyaOrig="984" w14:anchorId="4E5450F2">
+          <v:shape id="_x0000_i1063" type="#_x0000_t75" style="width:75pt;height:49.5pt" o:ole="">
             <v:imagedata r:id="rId15" o:title=""/>
           </v:shape>
-          <o:OLEObject Type="Embed" ProgID="Package" ShapeID="_x0000_i1046" DrawAspect="Icon" ObjectID="_1835635133" r:id="rId16"/>
+          <o:OLEObject Type="Embed" ProgID="Package" ShapeID="_x0000_i1063" DrawAspect="Icon" ObjectID="_1835705878" r:id="rId16"/>
         </w:object>
       </w:r>
     </w:p>
@@ -7379,7 +7379,7 @@
           <v:shape id="_x0000_i1049" type="#_x0000_t75" style="width:75pt;height:49.5pt" o:ole="">
             <v:imagedata r:id="rId17" o:title=""/>
           </v:shape>
-          <o:OLEObject Type="Embed" ProgID="Package" ShapeID="_x0000_i1049" DrawAspect="Icon" ObjectID="_1835635134" r:id="rId18"/>
+          <o:OLEObject Type="Embed" ProgID="Package" ShapeID="_x0000_i1049" DrawAspect="Icon" ObjectID="_1835705879" r:id="rId18"/>
         </w:object>
       </w:r>
     </w:p>
@@ -7399,7 +7399,7 @@
           <v:shape id="_x0000_i1050" type="#_x0000_t75" style="width:75pt;height:49.5pt" o:ole="">
             <v:imagedata r:id="rId19" o:title=""/>
           </v:shape>
-          <o:OLEObject Type="Embed" ProgID="Package" ShapeID="_x0000_i1050" DrawAspect="Icon" ObjectID="_1835635135" r:id="rId20"/>
+          <o:OLEObject Type="Embed" ProgID="Package" ShapeID="_x0000_i1050" DrawAspect="Icon" ObjectID="_1835705880" r:id="rId20"/>
         </w:object>
       </w:r>
     </w:p>
@@ -7419,7 +7419,7 @@
           <v:shape id="_x0000_i1051" type="#_x0000_t75" style="width:75pt;height:49.5pt" o:ole="">
             <v:imagedata r:id="rId21" o:title=""/>
           </v:shape>
-          <o:OLEObject Type="Embed" ProgID="Package" ShapeID="_x0000_i1051" DrawAspect="Icon" ObjectID="_1835635136" r:id="rId22"/>
+          <o:OLEObject Type="Embed" ProgID="Package" ShapeID="_x0000_i1051" DrawAspect="Icon" ObjectID="_1835705881" r:id="rId22"/>
         </w:object>
       </w:r>
     </w:p>
@@ -7477,7 +7477,7 @@
           <v:shape id="_x0000_i1054" type="#_x0000_t75" style="width:75pt;height:49.5pt" o:ole="">
             <v:imagedata r:id="rId23" o:title=""/>
           </v:shape>
-          <o:OLEObject Type="Embed" ProgID="Package" ShapeID="_x0000_i1054" DrawAspect="Icon" ObjectID="_1835635137" r:id="rId24"/>
+          <o:OLEObject Type="Embed" ProgID="Package" ShapeID="_x0000_i1054" DrawAspect="Icon" ObjectID="_1835705882" r:id="rId24"/>
         </w:object>
       </w:r>
     </w:p>
@@ -7493,11 +7493,47 @@
           <w:rFonts w:ascii="Calibri" w:hAnsi="Calibri" w:cs="Calibri"/>
           <w:lang w:val="en-CA" w:bidi="fa-IR"/>
         </w:rPr>
-        <w:object w:dxaOrig="1502" w:dyaOrig="984" w14:anchorId="1D28D30E">
-          <v:shape id="_x0000_i1055" type="#_x0000_t75" style="width:75pt;height:49.5pt" o:ole="">
+        <w:t>docker/</w:t>
+      </w:r>
+      <w:r>
+        <w:rPr>
+          <w:rFonts w:ascii="Calibri" w:hAnsi="Calibri" w:cs="Calibri"/>
+          <w:lang w:val="en-CA" w:bidi="fa-IR"/>
+        </w:rPr>
+        <w:t>runtime</w:t>
+      </w:r>
+      <w:r>
+        <w:rPr>
+          <w:rFonts w:ascii="Calibri" w:hAnsi="Calibri" w:cs="Calibri"/>
+          <w:lang w:val="en-CA" w:bidi="fa-IR"/>
+        </w:rPr>
+        <w:t>/Dockerfile</w:t>
+      </w:r>
+      <w:r>
+        <w:rPr>
+          <w:rFonts w:ascii="Calibri" w:hAnsi="Calibri" w:cs="Calibri"/>
+          <w:lang w:val="en-CA" w:bidi="fa-IR"/>
+        </w:rPr>
+        <w:t>:</w:t>
+      </w:r>
+    </w:p>
+    <w:p>
+      <w:pPr>
+        <w:rPr>
+          <w:rFonts w:ascii="Calibri" w:hAnsi="Calibri" w:cs="Calibri"/>
+          <w:lang w:val="en-CA" w:bidi="fa-IR"/>
+        </w:rPr>
+      </w:pPr>
+      <w:r>
+        <w:rPr>
+          <w:rFonts w:ascii="Calibri" w:hAnsi="Calibri" w:cs="Calibri"/>
+          <w:lang w:val="en-CA" w:bidi="fa-IR"/>
+        </w:rPr>
+        <w:object w:dxaOrig="1502" w:dyaOrig="984" w14:anchorId="0A5A7974">
+          <v:shape id="_x0000_i1064" type="#_x0000_t75" style="width:75pt;height:49.5pt" o:ole="">
             <v:imagedata r:id="rId25" o:title=""/>
           </v:shape>
-          <o:OLEObject Type="Embed" ProgID="Package" ShapeID="_x0000_i1055" DrawAspect="Icon" ObjectID="_1835635138" r:id="rId26"/>
+          <o:OLEObject Type="Embed" ProgID="Package" ShapeID="_x0000_i1064" DrawAspect="Icon" ObjectID="_1835705883" r:id="rId26"/>
         </w:object>
       </w:r>
     </w:p>
@@ -7513,11 +7549,33 @@
           <w:rFonts w:ascii="Calibri" w:hAnsi="Calibri" w:cs="Calibri"/>
           <w:lang w:val="en-CA" w:bidi="fa-IR"/>
         </w:rPr>
-        <w:object w:dxaOrig="1502" w:dyaOrig="984" w14:anchorId="5E48172E">
-          <v:shape id="_x0000_i1056" type="#_x0000_t75" style="width:75pt;height:49.5pt" o:ole="">
-            <v:imagedata r:id="rId27" o:title=""/>
+        <w:t>docker/airflow/Dockerfile</w:t>
+      </w:r>
+      <w:r>
+        <w:rPr>
+          <w:rFonts w:ascii="Calibri" w:hAnsi="Calibri" w:cs="Calibri"/>
+          <w:lang w:val="en-CA" w:bidi="fa-IR"/>
+        </w:rPr>
+        <w:t>:</w:t>
+      </w:r>
+    </w:p>
+    <w:p>
+      <w:pPr>
+        <w:rPr>
+          <w:rFonts w:ascii="Calibri" w:hAnsi="Calibri" w:cs="Calibri"/>
+          <w:lang w:val="en-CA" w:bidi="fa-IR"/>
+        </w:rPr>
+      </w:pPr>
+      <w:r>
+        <w:rPr>
+          <w:rFonts w:ascii="Calibri" w:hAnsi="Calibri" w:cs="Calibri"/>
+          <w:lang w:val="en-CA" w:bidi="fa-IR"/>
+        </w:rPr>
+        <w:object w:dxaOrig="1502" w:dyaOrig="984" w14:anchorId="093F45FF">
+          <v:shape id="_x0000_i1069" type="#_x0000_t75" style="width:75pt;height:49.5pt" o:ole="">
+            <v:imagedata r:id="rId25" o:title=""/>
           </v:shape>
-          <o:OLEObject Type="Embed" ProgID="Package" ShapeID="_x0000_i1056" DrawAspect="Icon" ObjectID="_1835635139" r:id="rId28"/>
+          <o:OLEObject Type="Embed" ProgID="Package" ShapeID="_x0000_i1069" DrawAspect="Icon" ObjectID="_1835705884" r:id="rId27"/>
         </w:object>
       </w:r>
     </w:p>
@@ -7541,6 +7599,142 @@
           <w:rFonts w:ascii="Calibri" w:hAnsi="Calibri" w:cs="Calibri"/>
           <w:lang w:val="en-CA" w:bidi="fa-IR"/>
         </w:rPr>
+        <w:t>docker build -t runtime:latest -f docker/runtime/Dockerfile .</w:t>
+      </w:r>
+    </w:p>
+    <w:p>
+      <w:pPr>
+        <w:rPr>
+          <w:rFonts w:ascii="Calibri" w:hAnsi="Calibri" w:cs="Calibri"/>
+          <w:lang w:val="en-CA" w:bidi="fa-IR"/>
+        </w:rPr>
+      </w:pPr>
+      <w:r>
+        <w:rPr>
+          <w:rFonts w:ascii="Calibri" w:hAnsi="Calibri" w:cs="Calibri"/>
+          <w:lang w:val="en-CA" w:bidi="fa-IR"/>
+        </w:rPr>
+        <w:t>docker build -t rltm_bi_pltfrm-airflow:latest -f docker/airflow/Dockerfile .</w:t>
+      </w:r>
+    </w:p>
+    <w:p>
+      <w:pPr>
+        <w:rPr>
+          <w:rFonts w:ascii="Calibri" w:hAnsi="Calibri" w:cs="Calibri"/>
+          <w:lang w:val="en-CA" w:bidi="fa-IR"/>
+        </w:rPr>
+      </w:pPr>
+      <w:r>
+        <w:rPr>
+          <w:rFonts w:ascii="Calibri" w:hAnsi="Calibri" w:cs="Calibri"/>
+          <w:lang w:val="en-CA" w:bidi="fa-IR"/>
+        </w:rPr>
+        <w:t>docker build -t rltm_bi_pltfrm-jupyter:latest -f docker/jupyter/Dockerfile .</w:t>
+      </w:r>
+    </w:p>
+    <w:p>
+      <w:pPr>
+        <w:rPr>
+          <w:rFonts w:ascii="Calibri" w:hAnsi="Calibri" w:cs="Calibri"/>
+          <w:lang w:val="en-CA" w:bidi="fa-IR"/>
+        </w:rPr>
+      </w:pPr>
+    </w:p>
+    <w:p>
+      <w:pPr>
+        <w:rPr>
+          <w:rFonts w:ascii="Calibri" w:hAnsi="Calibri" w:cs="Calibri"/>
+          <w:lang w:val="en-CA" w:bidi="fa-IR"/>
+        </w:rPr>
+      </w:pPr>
+      <w:r>
+        <w:rPr>
+          <w:rFonts w:ascii="Calibri" w:hAnsi="Calibri" w:cs="Calibri"/>
+          <w:lang w:val="en-CA" w:bidi="fa-IR"/>
+        </w:rPr>
+        <w:object w:dxaOrig="1502" w:dyaOrig="984" w14:anchorId="4177450A">
+          <v:shape id="_x0000_i1071" type="#_x0000_t75" style="width:75pt;height:49.5pt" o:ole="">
+            <v:imagedata r:id="rId28" o:title=""/>
+          </v:shape>
+          <o:OLEObject Type="Embed" ProgID="Package" ShapeID="_x0000_i1071" DrawAspect="Icon" ObjectID="_1835705885" r:id="rId29"/>
+        </w:object>
+      </w:r>
+    </w:p>
+    <w:p>
+      <w:pPr>
+        <w:rPr>
+          <w:rFonts w:ascii="Calibri" w:hAnsi="Calibri" w:cs="Calibri"/>
+          <w:lang w:val="en-CA" w:bidi="fa-IR"/>
+        </w:rPr>
+      </w:pPr>
+    </w:p>
+    <w:p>
+      <w:pPr>
+        <w:rPr>
+          <w:rFonts w:ascii="Calibri" w:hAnsi="Calibri" w:cs="Calibri"/>
+          <w:lang w:val="en-CA" w:bidi="fa-IR"/>
+        </w:rPr>
+      </w:pPr>
+    </w:p>
+    <w:p>
+      <w:pPr>
+        <w:rPr>
+          <w:rFonts w:ascii="Calibri" w:hAnsi="Calibri" w:cs="Calibri"/>
+          <w:lang w:val="en-CA" w:bidi="fa-IR"/>
+        </w:rPr>
+      </w:pPr>
+      <w:r>
+        <w:rPr>
+          <w:rFonts w:ascii="Calibri" w:hAnsi="Calibri" w:cs="Calibri"/>
+          <w:lang w:val="en-CA" w:bidi="fa-IR"/>
+        </w:rPr>
+        <w:t>docker compose -f compose.phase1.yaml -f compose.phase2.yaml exec airflow-api-server airflow config get-value api_auth jwt_secret</w:t>
+      </w:r>
+    </w:p>
+    <w:p>
+      <w:pPr>
+        <w:rPr>
+          <w:rFonts w:ascii="Calibri" w:hAnsi="Calibri" w:cs="Calibri"/>
+          <w:lang w:val="en-CA" w:bidi="fa-IR"/>
+        </w:rPr>
+      </w:pPr>
+      <w:r>
+        <w:rPr>
+          <w:rFonts w:ascii="Calibri" w:hAnsi="Calibri" w:cs="Calibri"/>
+          <w:lang w:val="en-CA" w:bidi="fa-IR"/>
+        </w:rPr>
+        <w:lastRenderedPageBreak/>
+        <w:t>docker compose -f compose.phase1.yaml -f compose.phase2.yaml exec airflow-api-server airflow config get-value api secret_key</w:t>
+      </w:r>
+    </w:p>
+    <w:p>
+      <w:pPr>
+        <w:rPr>
+          <w:rFonts w:ascii="Calibri" w:hAnsi="Calibri" w:cs="Calibri"/>
+          <w:lang w:val="en-CA" w:bidi="fa-IR"/>
+        </w:rPr>
+      </w:pPr>
+      <w:r>
+        <w:rPr>
+          <w:rFonts w:ascii="Calibri" w:hAnsi="Calibri" w:cs="Calibri"/>
+          <w:highlight w:val="yellow"/>
+          <w:lang w:val="en-CA" w:bidi="fa-IR"/>
+        </w:rPr>
+        <w:t>these secret should be same</w:t>
+      </w:r>
+    </w:p>
+    <w:p>
+      <w:pPr>
+        <w:rPr>
+          <w:rFonts w:ascii="Calibri" w:hAnsi="Calibri" w:cs="Calibri"/>
+          <w:lang w:val="en-CA" w:bidi="fa-IR"/>
+        </w:rPr>
+      </w:pPr>
+      <w:r>
+        <w:rPr>
+          <w:rFonts w:ascii="Calibri" w:hAnsi="Calibri" w:cs="Calibri"/>
+          <w:lang w:val="en-CA" w:bidi="fa-IR"/>
+        </w:rPr>
         <w:t>docker/airflow/Dockerfile</w:t>
       </w:r>
     </w:p>
@@ -7566,6 +7760,18 @@
           <w:lang w:val="en-CA" w:bidi="fa-IR"/>
         </w:rPr>
       </w:pPr>
+      <w:r>
+        <w:rPr>
+          <w:rFonts w:ascii="Calibri" w:hAnsi="Calibri" w:cs="Calibri"/>
+          <w:lang w:val="en-CA" w:bidi="fa-IR"/>
+        </w:rPr>
+        <w:object w:dxaOrig="1502" w:dyaOrig="984" w14:anchorId="361595C3">
+          <v:shape id="_x0000_i1072" type="#_x0000_t75" style="width:75pt;height:49.5pt" o:ole="">
+            <v:imagedata r:id="rId30" o:title=""/>
+          </v:shape>
+          <o:OLEObject Type="Embed" ProgID="Package" ShapeID="_x0000_i1072" DrawAspect="Icon" ObjectID="_1835705886" r:id="rId31"/>
+        </w:object>
+      </w:r>
     </w:p>
     <w:p>
       <w:pPr>
@@ -7620,9 +7826,9 @@
         </w:rPr>
         <w:object w:dxaOrig="1502" w:dyaOrig="984" w14:anchorId="78E28141">
           <v:shape id="_x0000_i1057" type="#_x0000_t75" style="width:75pt;height:49.5pt" o:ole="">
-            <v:imagedata r:id="rId29" o:title=""/>
+            <v:imagedata r:id="rId32" o:title=""/>
           </v:shape>
-          <o:OLEObject Type="Embed" ProgID="Package" ShapeID="_x0000_i1057" DrawAspect="Icon" ObjectID="_1835635140" r:id="rId30"/>
+          <o:OLEObject Type="Embed" ProgID="Package" ShapeID="_x0000_i1057" DrawAspect="Icon" ObjectID="_1835705887" r:id="rId33"/>
         </w:object>
       </w:r>
     </w:p>
@@ -7660,30 +7866,12 @@
           <w:lang w:val="en-CA" w:bidi="fa-IR"/>
         </w:rPr>
       </w:pPr>
-    </w:p>
-    <w:p>
-      <w:pPr>
+      <w:r>
         <w:rPr>
           <w:rFonts w:asciiTheme="majorHAnsi" w:hAnsiTheme="majorHAnsi"/>
           <w:szCs w:val="28"/>
           <w:lang w:val="en-CA" w:bidi="fa-IR"/>
         </w:rPr>
-      </w:pPr>
-    </w:p>
-    <w:p>
-      <w:pPr>
-        <w:rPr>
-          <w:rFonts w:asciiTheme="majorHAnsi" w:hAnsiTheme="majorHAnsi"/>
-          <w:szCs w:val="28"/>
-          <w:lang w:val="en-CA" w:bidi="fa-IR"/>
-        </w:rPr>
-      </w:pPr>
-      <w:r>
-        <w:rPr>
-          <w:rFonts w:asciiTheme="majorHAnsi" w:hAnsiTheme="majorHAnsi"/>
-          <w:szCs w:val="28"/>
-          <w:lang w:val="en-CA" w:bidi="fa-IR"/>
-        </w:rPr>
         <w:t>docker compose -f compose.phase1.yaml -f compose.phase2.yaml up -d airflow-api-server airflow-scheduler airflow-dag-processor</w:t>
       </w:r>
     </w:p>
@@ -7699,22 +7887,6 @@
       <w:pPr>
         <w:rPr>
           <w:rFonts w:ascii="Calibri" w:hAnsi="Calibri" w:cs="Calibri"/>
-          <w:lang w:val="en-CA" w:bidi="fa-IR"/>
-        </w:rPr>
-      </w:pPr>
-    </w:p>
-    <w:p>
-      <w:pPr>
-        <w:rPr>
-          <w:rFonts w:ascii="Calibri" w:hAnsi="Calibri" w:cs="Calibri"/>
-          <w:lang w:val="en-CA" w:bidi="fa-IR"/>
-        </w:rPr>
-      </w:pPr>
-    </w:p>
-    <w:p>
-      <w:pPr>
-        <w:rPr>
-          <w:rFonts w:ascii="Calibri" w:hAnsi="Calibri" w:cs="Calibri"/>
           <w:lang w:bidi="fa-IR"/>
         </w:rPr>
       </w:pPr>
@@ -7725,7 +7897,7 @@
         </w:rPr>
         <w:t xml:space="preserve">Airflow UI:  </w:t>
       </w:r>
-      <w:hyperlink r:id="rId31" w:history="1">
+      <w:hyperlink r:id="rId34" w:history="1">
         <w:r>
           <w:rPr>
             <w:rStyle w:val="Hyperlink"/>
@@ -10289,7 +10461,7 @@
   <w:style w:type="paragraph" w:default="1" w:styleId="Normal">
     <w:name w:val="Normal"/>
     <w:qFormat/>
-    <w:rsid w:val="00B245FE"/>
+    <w:rsid w:val="00BB1131"/>
     <w:pPr>
       <w:spacing w:after="200" w:line="276" w:lineRule="auto"/>
     </w:pPr>

</xml_diff>

<commit_message>
bronze to silver job for user events
</commit_message>
<xml_diff>
--- a/docs/BI Platform Architecture.docx
+++ b/docs/BI Platform Architecture.docx
@@ -7179,10 +7179,10 @@
             <v:path o:extrusionok="f" gradientshapeok="t" o:connecttype="rect"/>
             <o:lock v:ext="edit" aspectratio="t"/>
           </v:shapetype>
-          <v:shape id="_x0000_i1059" type="#_x0000_t75" style="width:75pt;height:49.5pt" o:ole="">
+          <v:shape id="_x0000_i1034" type="#_x0000_t75" style="width:75pt;height:49.5pt" o:ole="">
             <v:imagedata r:id="rId7" o:title=""/>
           </v:shape>
-          <o:OLEObject Type="Embed" ProgID="Package" ShapeID="_x0000_i1059" DrawAspect="Icon" ObjectID="_1835705874" r:id="rId8"/>
+          <o:OLEObject Type="Embed" ProgID="Package" ShapeID="_x0000_i1034" DrawAspect="Icon" ObjectID="_1835849298" r:id="rId8"/>
         </w:object>
       </w:r>
     </w:p>
@@ -7214,10 +7214,10 @@
           <w:lang w:val="en-CA" w:bidi="fa-IR"/>
         </w:rPr>
         <w:object w:dxaOrig="1502" w:dyaOrig="984" w14:anchorId="2C4D17AF">
-          <v:shape id="_x0000_i1045" type="#_x0000_t75" style="width:75pt;height:49.5pt" o:ole="">
+          <v:shape id="_x0000_i1035" type="#_x0000_t75" style="width:75pt;height:49.5pt" o:ole="">
             <v:imagedata r:id="rId9" o:title=""/>
           </v:shape>
-          <o:OLEObject Type="Embed" ProgID="Package" ShapeID="_x0000_i1045" DrawAspect="Icon" ObjectID="_1835705875" r:id="rId10"/>
+          <o:OLEObject Type="Embed" ProgID="Package" ShapeID="_x0000_i1035" DrawAspect="Icon" ObjectID="_1835849299" r:id="rId10"/>
         </w:object>
       </w:r>
     </w:p>
@@ -7249,10 +7249,10 @@
           <w:lang w:val="en-CA" w:bidi="fa-IR"/>
         </w:rPr>
         <w:object w:dxaOrig="1502" w:dyaOrig="984" w14:anchorId="3BE9501E">
-          <v:shape id="_x0000_i1040" type="#_x0000_t75" style="width:75pt;height:49.5pt" o:ole="">
+          <v:shape id="_x0000_i1036" type="#_x0000_t75" style="width:75pt;height:49.5pt" o:ole="">
             <v:imagedata r:id="rId11" o:title=""/>
           </v:shape>
-          <o:OLEObject Type="Embed" ProgID="Package" ShapeID="_x0000_i1040" DrawAspect="Icon" ObjectID="_1835705876" r:id="rId12"/>
+          <o:OLEObject Type="Embed" ProgID="Package" ShapeID="_x0000_i1036" DrawAspect="Icon" ObjectID="_1835849300" r:id="rId12"/>
         </w:object>
       </w:r>
     </w:p>
@@ -7284,10 +7284,10 @@
           <w:lang w:val="en-CA" w:bidi="fa-IR"/>
         </w:rPr>
         <w:object w:dxaOrig="1502" w:dyaOrig="984" w14:anchorId="6A99CC73">
-          <v:shape id="_x0000_i1041" type="#_x0000_t75" style="width:75pt;height:49.5pt" o:ole="">
+          <v:shape id="_x0000_i1037" type="#_x0000_t75" style="width:75pt;height:49.5pt" o:ole="">
             <v:imagedata r:id="rId13" o:title=""/>
           </v:shape>
-          <o:OLEObject Type="Embed" ProgID="Package" ShapeID="_x0000_i1041" DrawAspect="Icon" ObjectID="_1835705877" r:id="rId14"/>
+          <o:OLEObject Type="Embed" ProgID="Package" ShapeID="_x0000_i1037" DrawAspect="Icon" ObjectID="_1835849301" r:id="rId14"/>
         </w:object>
       </w:r>
     </w:p>
@@ -7356,10 +7356,10 @@
           <w:lang w:val="en-CA" w:bidi="fa-IR"/>
         </w:rPr>
         <w:object w:dxaOrig="1502" w:dyaOrig="984" w14:anchorId="4E5450F2">
-          <v:shape id="_x0000_i1063" type="#_x0000_t75" style="width:75pt;height:49.5pt" o:ole="">
+          <v:shape id="_x0000_i1038" type="#_x0000_t75" style="width:75pt;height:49.5pt" o:ole="">
             <v:imagedata r:id="rId15" o:title=""/>
           </v:shape>
-          <o:OLEObject Type="Embed" ProgID="Package" ShapeID="_x0000_i1063" DrawAspect="Icon" ObjectID="_1835705878" r:id="rId16"/>
+          <o:OLEObject Type="Embed" ProgID="Package" ShapeID="_x0000_i1038" DrawAspect="Icon" ObjectID="_1835849302" r:id="rId16"/>
         </w:object>
       </w:r>
     </w:p>
@@ -7376,10 +7376,10 @@
           <w:lang w:val="en-CA" w:bidi="fa-IR"/>
         </w:rPr>
         <w:object w:dxaOrig="1502" w:dyaOrig="984" w14:anchorId="61560D2A">
-          <v:shape id="_x0000_i1049" type="#_x0000_t75" style="width:75pt;height:49.5pt" o:ole="">
+          <v:shape id="_x0000_i1039" type="#_x0000_t75" style="width:75pt;height:49.5pt" o:ole="">
             <v:imagedata r:id="rId17" o:title=""/>
           </v:shape>
-          <o:OLEObject Type="Embed" ProgID="Package" ShapeID="_x0000_i1049" DrawAspect="Icon" ObjectID="_1835705879" r:id="rId18"/>
+          <o:OLEObject Type="Embed" ProgID="Package" ShapeID="_x0000_i1039" DrawAspect="Icon" ObjectID="_1835849303" r:id="rId18"/>
         </w:object>
       </w:r>
     </w:p>
@@ -7396,10 +7396,10 @@
           <w:lang w:val="en-CA" w:bidi="fa-IR"/>
         </w:rPr>
         <w:object w:dxaOrig="1502" w:dyaOrig="984" w14:anchorId="02912D38">
-          <v:shape id="_x0000_i1050" type="#_x0000_t75" style="width:75pt;height:49.5pt" o:ole="">
+          <v:shape id="_x0000_i1040" type="#_x0000_t75" style="width:75pt;height:49.5pt" o:ole="">
             <v:imagedata r:id="rId19" o:title=""/>
           </v:shape>
-          <o:OLEObject Type="Embed" ProgID="Package" ShapeID="_x0000_i1050" DrawAspect="Icon" ObjectID="_1835705880" r:id="rId20"/>
+          <o:OLEObject Type="Embed" ProgID="Package" ShapeID="_x0000_i1040" DrawAspect="Icon" ObjectID="_1835849304" r:id="rId20"/>
         </w:object>
       </w:r>
     </w:p>
@@ -7416,10 +7416,10 @@
           <w:lang w:val="en-CA" w:bidi="fa-IR"/>
         </w:rPr>
         <w:object w:dxaOrig="1502" w:dyaOrig="984" w14:anchorId="51B4FBEC">
-          <v:shape id="_x0000_i1051" type="#_x0000_t75" style="width:75pt;height:49.5pt" o:ole="">
+          <v:shape id="_x0000_i1041" type="#_x0000_t75" style="width:75pt;height:49.5pt" o:ole="">
             <v:imagedata r:id="rId21" o:title=""/>
           </v:shape>
-          <o:OLEObject Type="Embed" ProgID="Package" ShapeID="_x0000_i1051" DrawAspect="Icon" ObjectID="_1835705881" r:id="rId22"/>
+          <o:OLEObject Type="Embed" ProgID="Package" ShapeID="_x0000_i1041" DrawAspect="Icon" ObjectID="_1835849305" r:id="rId22"/>
         </w:object>
       </w:r>
     </w:p>
@@ -7474,10 +7474,10 @@
           <w:lang w:val="en-CA" w:bidi="fa-IR"/>
         </w:rPr>
         <w:object w:dxaOrig="1502" w:dyaOrig="984" w14:anchorId="74889788">
-          <v:shape id="_x0000_i1054" type="#_x0000_t75" style="width:75pt;height:49.5pt" o:ole="">
+          <v:shape id="_x0000_i1042" type="#_x0000_t75" style="width:75pt;height:49.5pt" o:ole="">
             <v:imagedata r:id="rId23" o:title=""/>
           </v:shape>
-          <o:OLEObject Type="Embed" ProgID="Package" ShapeID="_x0000_i1054" DrawAspect="Icon" ObjectID="_1835705882" r:id="rId24"/>
+          <o:OLEObject Type="Embed" ProgID="Package" ShapeID="_x0000_i1042" DrawAspect="Icon" ObjectID="_1835849306" r:id="rId24"/>
         </w:object>
       </w:r>
     </w:p>
@@ -7530,10 +7530,10 @@
           <w:lang w:val="en-CA" w:bidi="fa-IR"/>
         </w:rPr>
         <w:object w:dxaOrig="1502" w:dyaOrig="984" w14:anchorId="0A5A7974">
-          <v:shape id="_x0000_i1064" type="#_x0000_t75" style="width:75pt;height:49.5pt" o:ole="">
+          <v:shape id="_x0000_i1043" type="#_x0000_t75" style="width:75pt;height:49.5pt" o:ole="">
             <v:imagedata r:id="rId25" o:title=""/>
           </v:shape>
-          <o:OLEObject Type="Embed" ProgID="Package" ShapeID="_x0000_i1064" DrawAspect="Icon" ObjectID="_1835705883" r:id="rId26"/>
+          <o:OLEObject Type="Embed" ProgID="Package" ShapeID="_x0000_i1043" DrawAspect="Icon" ObjectID="_1835849307" r:id="rId26"/>
         </w:object>
       </w:r>
     </w:p>
@@ -7572,10 +7572,10 @@
           <w:lang w:val="en-CA" w:bidi="fa-IR"/>
         </w:rPr>
         <w:object w:dxaOrig="1502" w:dyaOrig="984" w14:anchorId="093F45FF">
-          <v:shape id="_x0000_i1069" type="#_x0000_t75" style="width:75pt;height:49.5pt" o:ole="">
+          <v:shape id="_x0000_i1044" type="#_x0000_t75" style="width:75pt;height:49.5pt" o:ole="">
             <v:imagedata r:id="rId25" o:title=""/>
           </v:shape>
-          <o:OLEObject Type="Embed" ProgID="Package" ShapeID="_x0000_i1069" DrawAspect="Icon" ObjectID="_1835705884" r:id="rId27"/>
+          <o:OLEObject Type="Embed" ProgID="Package" ShapeID="_x0000_i1044" DrawAspect="Icon" ObjectID="_1835849308" r:id="rId27"/>
         </w:object>
       </w:r>
     </w:p>
@@ -7653,10 +7653,10 @@
           <w:lang w:val="en-CA" w:bidi="fa-IR"/>
         </w:rPr>
         <w:object w:dxaOrig="1502" w:dyaOrig="984" w14:anchorId="4177450A">
-          <v:shape id="_x0000_i1071" type="#_x0000_t75" style="width:75pt;height:49.5pt" o:ole="">
+          <v:shape id="_x0000_i1045" type="#_x0000_t75" style="width:75pt;height:49.5pt" o:ole="">
             <v:imagedata r:id="rId28" o:title=""/>
           </v:shape>
-          <o:OLEObject Type="Embed" ProgID="Package" ShapeID="_x0000_i1071" DrawAspect="Icon" ObjectID="_1835705885" r:id="rId29"/>
+          <o:OLEObject Type="Embed" ProgID="Package" ShapeID="_x0000_i1045" DrawAspect="Icon" ObjectID="_1835849309" r:id="rId29"/>
         </w:object>
       </w:r>
     </w:p>
@@ -7766,10 +7766,10 @@
           <w:lang w:val="en-CA" w:bidi="fa-IR"/>
         </w:rPr>
         <w:object w:dxaOrig="1502" w:dyaOrig="984" w14:anchorId="361595C3">
-          <v:shape id="_x0000_i1072" type="#_x0000_t75" style="width:75pt;height:49.5pt" o:ole="">
+          <v:shape id="_x0000_i1046" type="#_x0000_t75" style="width:75pt;height:49.5pt" o:ole="">
             <v:imagedata r:id="rId30" o:title=""/>
           </v:shape>
-          <o:OLEObject Type="Embed" ProgID="Package" ShapeID="_x0000_i1072" DrawAspect="Icon" ObjectID="_1835705886" r:id="rId31"/>
+          <o:OLEObject Type="Embed" ProgID="Package" ShapeID="_x0000_i1046" DrawAspect="Icon" ObjectID="_1835849310" r:id="rId31"/>
         </w:object>
       </w:r>
     </w:p>
@@ -7825,10 +7825,10 @@
           <w:lang w:val="en-CA" w:bidi="fa-IR"/>
         </w:rPr>
         <w:object w:dxaOrig="1502" w:dyaOrig="984" w14:anchorId="78E28141">
-          <v:shape id="_x0000_i1057" type="#_x0000_t75" style="width:75pt;height:49.5pt" o:ole="">
+          <v:shape id="_x0000_i1047" type="#_x0000_t75" style="width:75pt;height:49.5pt" o:ole="">
             <v:imagedata r:id="rId32" o:title=""/>
           </v:shape>
-          <o:OLEObject Type="Embed" ProgID="Package" ShapeID="_x0000_i1057" DrawAspect="Icon" ObjectID="_1835705887" r:id="rId33"/>
+          <o:OLEObject Type="Embed" ProgID="Package" ShapeID="_x0000_i1047" DrawAspect="Icon" ObjectID="_1835849311" r:id="rId33"/>
         </w:object>
       </w:r>
     </w:p>
@@ -7936,6 +7936,1015 @@
           <w:lang w:val="en-CA" w:bidi="fa-IR"/>
         </w:rPr>
         <w:t>password: airflow</w:t>
+      </w:r>
+    </w:p>
+    <w:p>
+      <w:pPr>
+        <w:rPr>
+          <w:rFonts w:ascii="Calibri" w:hAnsi="Calibri" w:cs="Calibri"/>
+          <w:lang w:val="en-CA" w:bidi="fa-IR"/>
+        </w:rPr>
+      </w:pPr>
+    </w:p>
+    <w:p>
+      <w:pPr>
+        <w:rPr>
+          <w:rFonts w:ascii="Calibri" w:hAnsi="Calibri" w:cs="Calibri"/>
+          <w:lang w:val="en-CA" w:bidi="fa-IR"/>
+        </w:rPr>
+      </w:pPr>
+    </w:p>
+    <w:p>
+      <w:pPr>
+        <w:rPr>
+          <w:rFonts w:ascii="Calibri" w:hAnsi="Calibri" w:cs="Calibri"/>
+          <w:b/>
+          <w:bCs/>
+          <w:lang w:val="en-CA" w:bidi="fa-IR"/>
+        </w:rPr>
+      </w:pPr>
+      <w:r>
+        <w:rPr>
+          <w:rFonts w:ascii="Calibri" w:hAnsi="Calibri" w:cs="Calibri"/>
+          <w:b/>
+          <w:bCs/>
+          <w:lang w:val="en-CA" w:bidi="fa-IR"/>
+        </w:rPr>
+        <w:t>Phase 2 – Stream Processing with Clickstream Data</w:t>
+      </w:r>
+    </w:p>
+    <w:p>
+      <w:pPr>
+        <w:rPr>
+          <w:rFonts w:ascii="Calibri" w:hAnsi="Calibri" w:cs="Calibri"/>
+          <w:lang w:val="en-CA" w:bidi="fa-IR"/>
+        </w:rPr>
+      </w:pPr>
+      <w:r>
+        <w:rPr>
+          <w:rFonts w:ascii="Calibri" w:hAnsi="Calibri" w:cs="Calibri"/>
+          <w:lang w:val="en-CA" w:bidi="fa-IR"/>
+        </w:rPr>
+        <w:t>In Phase 2, the platform was extended from static infrastructure setup to a real clickstream ingestion pipeline. The objective of this phase was to simulate user activity in an e-commerce environment, capture event data from multiple sources, and move these events through a streaming architecture for storage in the Bronze layer.</w:t>
+      </w:r>
+    </w:p>
+    <w:p>
+      <w:pPr>
+        <w:rPr>
+          <w:rFonts w:ascii="Calibri" w:hAnsi="Calibri" w:cs="Calibri"/>
+          <w:lang w:val="en-CA" w:bidi="fa-IR"/>
+        </w:rPr>
+      </w:pPr>
+      <w:r>
+        <w:rPr>
+          <w:rFonts w:ascii="Calibri" w:hAnsi="Calibri" w:cs="Calibri"/>
+          <w:lang w:val="en-CA" w:bidi="fa-IR"/>
+        </w:rPr>
+        <w:lastRenderedPageBreak/>
+        <w:t>The clickstream pipeline was designed to capture three main categories of input:</w:t>
+      </w:r>
+    </w:p>
+    <w:p>
+      <w:pPr>
+        <w:numPr>
+          <w:ilvl w:val="0"/>
+          <w:numId w:val="17"/>
+        </w:numPr>
+        <w:rPr>
+          <w:rFonts w:ascii="Calibri" w:hAnsi="Calibri" w:cs="Calibri"/>
+          <w:lang w:val="en-CA" w:bidi="fa-IR"/>
+        </w:rPr>
+      </w:pPr>
+      <w:r>
+        <w:rPr>
+          <w:rFonts w:ascii="Calibri" w:hAnsi="Calibri" w:cs="Calibri"/>
+          <w:b/>
+          <w:bCs/>
+          <w:lang w:val="en-CA" w:bidi="fa-IR"/>
+        </w:rPr>
+        <w:t>Backend events</w:t>
+      </w:r>
+      <w:r>
+        <w:rPr>
+          <w:rFonts w:ascii="Calibri" w:hAnsi="Calibri" w:cs="Calibri"/>
+          <w:lang w:val="en-CA" w:bidi="fa-IR"/>
+        </w:rPr>
+        <w:br/>
+        <w:t xml:space="preserve">These events represent server-side or application-side actions, such as backend logs, order checks, inventory checks, and other structured events generated by the web application backend. </w:t>
+      </w:r>
+    </w:p>
+    <w:p>
+      <w:pPr>
+        <w:numPr>
+          <w:ilvl w:val="0"/>
+          <w:numId w:val="17"/>
+        </w:numPr>
+        <w:rPr>
+          <w:rFonts w:ascii="Calibri" w:hAnsi="Calibri" w:cs="Calibri"/>
+          <w:lang w:val="en-CA" w:bidi="fa-IR"/>
+        </w:rPr>
+      </w:pPr>
+      <w:r>
+        <w:rPr>
+          <w:rFonts w:ascii="Calibri" w:hAnsi="Calibri" w:cs="Calibri"/>
+          <w:b/>
+          <w:bCs/>
+          <w:lang w:val="en-CA" w:bidi="fa-IR"/>
+        </w:rPr>
+        <w:t>Frontend events</w:t>
+      </w:r>
+      <w:r>
+        <w:rPr>
+          <w:rFonts w:ascii="Calibri" w:hAnsi="Calibri" w:cs="Calibri"/>
+          <w:lang w:val="en-CA" w:bidi="fa-IR"/>
+        </w:rPr>
+        <w:br/>
+        <w:t xml:space="preserve">These events represent browser-side user interactions, such as page views, product views, add-to-cart actions, and other interactions generated directly from the user interface. </w:t>
+      </w:r>
+    </w:p>
+    <w:p>
+      <w:pPr>
+        <w:numPr>
+          <w:ilvl w:val="0"/>
+          <w:numId w:val="17"/>
+        </w:numPr>
+        <w:rPr>
+          <w:rFonts w:ascii="Calibri" w:hAnsi="Calibri" w:cs="Calibri"/>
+          <w:lang w:val="en-CA" w:bidi="fa-IR"/>
+        </w:rPr>
+      </w:pPr>
+      <w:r>
+        <w:rPr>
+          <w:rFonts w:ascii="Calibri" w:hAnsi="Calibri" w:cs="Calibri"/>
+          <w:b/>
+          <w:bCs/>
+          <w:lang w:val="en-CA" w:bidi="fa-IR"/>
+        </w:rPr>
+        <w:t>Cookie and session identity data</w:t>
+      </w:r>
+      <w:r>
+        <w:rPr>
+          <w:rFonts w:ascii="Calibri" w:hAnsi="Calibri" w:cs="Calibri"/>
+          <w:lang w:val="en-CA" w:bidi="fa-IR"/>
+        </w:rPr>
+        <w:br/>
+        <w:t xml:space="preserve">In addition to frontend and backend events, browser cookies were used to maintain anonymous user identity and session continuity. Specifically, anonymous_id and session_id were attached to events to distinguish between repeated page refreshes, new sessions, and simulated new users. </w:t>
+      </w:r>
+    </w:p>
+    <w:p>
+      <w:pPr>
+        <w:rPr>
+          <w:rFonts w:ascii="Calibri" w:hAnsi="Calibri" w:cs="Calibri"/>
+          <w:b/>
+          <w:bCs/>
+          <w:lang w:val="en-CA" w:bidi="fa-IR"/>
+        </w:rPr>
+      </w:pPr>
+      <w:r>
+        <w:rPr>
+          <w:rFonts w:ascii="Calibri" w:hAnsi="Calibri" w:cs="Calibri"/>
+          <w:b/>
+          <w:bCs/>
+          <w:lang w:val="en-CA" w:bidi="fa-IR"/>
+        </w:rPr>
+        <w:t>Web Simulator</w:t>
+      </w:r>
+    </w:p>
+    <w:p>
+      <w:pPr>
+        <w:rPr>
+          <w:rFonts w:ascii="Calibri" w:hAnsi="Calibri" w:cs="Calibri"/>
+          <w:lang w:val="en-CA" w:bidi="fa-IR"/>
+        </w:rPr>
+      </w:pPr>
+      <w:r>
+        <w:rPr>
+          <w:rFonts w:ascii="Calibri" w:hAnsi="Calibri" w:cs="Calibri"/>
+          <w:lang w:val="en-CA" w:bidi="fa-IR"/>
+        </w:rPr>
+        <w:t>To generate realistic clickstream data, a lightweight web page simulator was developed.</w:t>
+      </w:r>
+      <w:r>
+        <w:rPr>
+          <w:rFonts w:ascii="Calibri" w:hAnsi="Calibri" w:cs="Calibri"/>
+          <w:lang w:val="en-CA" w:bidi="fa-IR"/>
+        </w:rPr>
+        <w:br/>
+        <w:t>This simulator acted as a simplified e-commerce website and was used to produce:</w:t>
+      </w:r>
+    </w:p>
+    <w:p>
+      <w:pPr>
+        <w:numPr>
+          <w:ilvl w:val="0"/>
+          <w:numId w:val="18"/>
+        </w:numPr>
+        <w:rPr>
+          <w:rFonts w:ascii="Calibri" w:hAnsi="Calibri" w:cs="Calibri"/>
+          <w:lang w:val="en-CA" w:bidi="fa-IR"/>
+        </w:rPr>
+      </w:pPr>
+      <w:r>
+        <w:rPr>
+          <w:rFonts w:ascii="Calibri" w:hAnsi="Calibri" w:cs="Calibri"/>
+          <w:lang w:val="en-CA" w:bidi="fa-IR"/>
+        </w:rPr>
+        <w:t xml:space="preserve">frontend interaction events, </w:t>
+      </w:r>
+    </w:p>
+    <w:p>
+      <w:pPr>
+        <w:numPr>
+          <w:ilvl w:val="0"/>
+          <w:numId w:val="18"/>
+        </w:numPr>
+        <w:rPr>
+          <w:rFonts w:ascii="Calibri" w:hAnsi="Calibri" w:cs="Calibri"/>
+          <w:lang w:val="en-CA" w:bidi="fa-IR"/>
+        </w:rPr>
+      </w:pPr>
+      <w:r>
+        <w:rPr>
+          <w:rFonts w:ascii="Calibri" w:hAnsi="Calibri" w:cs="Calibri"/>
+          <w:lang w:val="en-CA" w:bidi="fa-IR"/>
+        </w:rPr>
+        <w:t xml:space="preserve">backend application events, </w:t>
+      </w:r>
+    </w:p>
+    <w:p>
+      <w:pPr>
+        <w:numPr>
+          <w:ilvl w:val="0"/>
+          <w:numId w:val="18"/>
+        </w:numPr>
+        <w:rPr>
+          <w:rFonts w:ascii="Calibri" w:hAnsi="Calibri" w:cs="Calibri"/>
+          <w:lang w:val="en-CA" w:bidi="fa-IR"/>
+        </w:rPr>
+      </w:pPr>
+      <w:r>
+        <w:rPr>
+          <w:rFonts w:ascii="Calibri" w:hAnsi="Calibri" w:cs="Calibri"/>
+          <w:lang w:val="en-CA" w:bidi="fa-IR"/>
+        </w:rPr>
+        <w:t xml:space="preserve">cookie-based anonymous and session identifiers. </w:t>
+      </w:r>
+    </w:p>
+    <w:p>
+      <w:pPr>
+        <w:rPr>
+          <w:rFonts w:ascii="Calibri" w:hAnsi="Calibri" w:cs="Calibri"/>
+          <w:lang w:val="en-CA" w:bidi="fa-IR"/>
+        </w:rPr>
+      </w:pPr>
+      <w:r>
+        <w:rPr>
+          <w:rFonts w:ascii="Calibri" w:hAnsi="Calibri" w:cs="Calibri"/>
+          <w:lang w:val="en-CA" w:bidi="fa-IR"/>
+        </w:rPr>
+        <w:t>The simulator made it possible to test the end-to-end streaming pipeline in a controlled local environment before connecting the architecture to real production applications.</w:t>
+      </w:r>
+    </w:p>
+    <w:p>
+      <w:pPr>
+        <w:rPr>
+          <w:rFonts w:ascii="Calibri" w:hAnsi="Calibri" w:cs="Calibri"/>
+          <w:lang w:val="en-CA" w:bidi="fa-IR"/>
+        </w:rPr>
+      </w:pPr>
+      <w:r>
+        <w:rPr>
+          <w:rFonts w:ascii="Calibri" w:hAnsi="Calibri" w:cs="Calibri"/>
+          <w:lang w:val="en-CA" w:bidi="fa-IR"/>
+        </w:rPr>
+        <w:t>Further Best practice for handling events for ecommerce events</w:t>
+      </w:r>
+    </w:p>
+    <w:p>
+      <w:pPr>
+        <w:rPr>
+          <w:rFonts w:ascii="Calibri" w:hAnsi="Calibri" w:cs="Calibri"/>
+          <w:lang w:val="en-CA" w:bidi="fa-IR"/>
+        </w:rPr>
+      </w:pPr>
+      <w:r>
+        <w:rPr>
+          <w:rFonts w:ascii="Calibri" w:hAnsi="Calibri" w:cs="Calibri"/>
+          <w:lang w:val="en-CA" w:bidi="fa-IR"/>
+        </w:rPr>
+        <w:object w:dxaOrig="1502" w:dyaOrig="984" w14:anchorId="3D7288F8">
+          <v:shape id="_x0000_i1048" type="#_x0000_t75" style="width:75pt;height:49.5pt" o:ole="">
+            <v:imagedata r:id="rId35" o:title=""/>
+          </v:shape>
+          <o:OLEObject Type="Embed" ProgID="Package" ShapeID="_x0000_i1048" DrawAspect="Icon" ObjectID="_1835849312" r:id="rId36"/>
+        </w:object>
+      </w:r>
+    </w:p>
+    <w:p>
+      <w:pPr>
+        <w:rPr>
+          <w:rFonts w:ascii="Calibri" w:hAnsi="Calibri" w:cs="Calibri"/>
+          <w:b/>
+          <w:bCs/>
+          <w:lang w:val="en-CA" w:bidi="fa-IR"/>
+        </w:rPr>
+      </w:pPr>
+      <w:r>
+        <w:rPr>
+          <w:rFonts w:ascii="Calibri" w:hAnsi="Calibri" w:cs="Calibri"/>
+          <w:b/>
+          <w:bCs/>
+          <w:lang w:val="en-CA" w:bidi="fa-IR"/>
+        </w:rPr>
+        <w:t>Collector Application</w:t>
+      </w:r>
+    </w:p>
+    <w:p>
+      <w:pPr>
+        <w:rPr>
+          <w:rFonts w:ascii="Calibri" w:hAnsi="Calibri" w:cs="Calibri"/>
+          <w:lang w:val="en-CA" w:bidi="fa-IR"/>
+        </w:rPr>
+      </w:pPr>
+      <w:r>
+        <w:rPr>
+          <w:rFonts w:ascii="Calibri" w:hAnsi="Calibri" w:cs="Calibri"/>
+          <w:lang w:val="en-CA" w:bidi="fa-IR"/>
+        </w:rPr>
+        <w:t xml:space="preserve">A dedicated </w:t>
+      </w:r>
+      <w:r>
+        <w:rPr>
+          <w:rFonts w:ascii="Calibri" w:hAnsi="Calibri" w:cs="Calibri"/>
+          <w:b/>
+          <w:bCs/>
+          <w:lang w:val="en-CA" w:bidi="fa-IR"/>
+        </w:rPr>
+        <w:t>collector application</w:t>
+      </w:r>
+      <w:r>
+        <w:rPr>
+          <w:rFonts w:ascii="Calibri" w:hAnsi="Calibri" w:cs="Calibri"/>
+          <w:lang w:val="en-CA" w:bidi="fa-IR"/>
+        </w:rPr>
+        <w:t xml:space="preserve"> was then developed to receive all generated events.</w:t>
+      </w:r>
+      <w:r>
+        <w:rPr>
+          <w:rFonts w:ascii="Calibri" w:hAnsi="Calibri" w:cs="Calibri"/>
+          <w:lang w:val="en-CA" w:bidi="fa-IR"/>
+        </w:rPr>
+        <w:br/>
+        <w:t>Its main responsibilities were:</w:t>
+      </w:r>
+    </w:p>
+    <w:p>
+      <w:pPr>
+        <w:numPr>
+          <w:ilvl w:val="0"/>
+          <w:numId w:val="19"/>
+        </w:numPr>
+        <w:rPr>
+          <w:rFonts w:ascii="Calibri" w:hAnsi="Calibri" w:cs="Calibri"/>
+          <w:lang w:val="en-CA" w:bidi="fa-IR"/>
+        </w:rPr>
+      </w:pPr>
+      <w:r>
+        <w:rPr>
+          <w:rFonts w:ascii="Calibri" w:hAnsi="Calibri" w:cs="Calibri"/>
+          <w:lang w:val="en-CA" w:bidi="fa-IR"/>
+        </w:rPr>
+        <w:t xml:space="preserve">accepting frontend and backend event payloads, </w:t>
+      </w:r>
+    </w:p>
+    <w:p>
+      <w:pPr>
+        <w:numPr>
+          <w:ilvl w:val="0"/>
+          <w:numId w:val="19"/>
+        </w:numPr>
+        <w:rPr>
+          <w:rFonts w:ascii="Calibri" w:hAnsi="Calibri" w:cs="Calibri"/>
+          <w:lang w:val="en-CA" w:bidi="fa-IR"/>
+        </w:rPr>
+      </w:pPr>
+      <w:r>
+        <w:rPr>
+          <w:rFonts w:ascii="Calibri" w:hAnsi="Calibri" w:cs="Calibri"/>
+          <w:lang w:val="en-CA" w:bidi="fa-IR"/>
+        </w:rPr>
+        <w:t xml:space="preserve">validating and enriching incoming events, </w:t>
+      </w:r>
+    </w:p>
+    <w:p>
+      <w:pPr>
+        <w:numPr>
+          <w:ilvl w:val="0"/>
+          <w:numId w:val="19"/>
+        </w:numPr>
+        <w:rPr>
+          <w:rFonts w:ascii="Calibri" w:hAnsi="Calibri" w:cs="Calibri"/>
+          <w:lang w:val="en-CA" w:bidi="fa-IR"/>
+        </w:rPr>
+      </w:pPr>
+      <w:r>
+        <w:rPr>
+          <w:rFonts w:ascii="Calibri" w:hAnsi="Calibri" w:cs="Calibri"/>
+          <w:lang w:val="en-CA" w:bidi="fa-IR"/>
+        </w:rPr>
+        <w:t xml:space="preserve">attaching collection metadata such as receipt timestamp, </w:t>
+      </w:r>
+    </w:p>
+    <w:p>
+      <w:pPr>
+        <w:numPr>
+          <w:ilvl w:val="0"/>
+          <w:numId w:val="19"/>
+        </w:numPr>
+        <w:rPr>
+          <w:rFonts w:ascii="Calibri" w:hAnsi="Calibri" w:cs="Calibri"/>
+          <w:lang w:val="en-CA" w:bidi="fa-IR"/>
+        </w:rPr>
+      </w:pPr>
+      <w:r>
+        <w:rPr>
+          <w:rFonts w:ascii="Calibri" w:hAnsi="Calibri" w:cs="Calibri"/>
+          <w:lang w:val="en-CA" w:bidi="fa-IR"/>
+        </w:rPr>
+        <w:lastRenderedPageBreak/>
+        <w:t xml:space="preserve">forwarding events to Kafka, </w:t>
+      </w:r>
+    </w:p>
+    <w:p>
+      <w:pPr>
+        <w:numPr>
+          <w:ilvl w:val="0"/>
+          <w:numId w:val="19"/>
+        </w:numPr>
+        <w:rPr>
+          <w:rFonts w:ascii="Calibri" w:hAnsi="Calibri" w:cs="Calibri"/>
+          <w:lang w:val="en-CA" w:bidi="fa-IR"/>
+        </w:rPr>
+      </w:pPr>
+      <w:r>
+        <w:rPr>
+          <w:rFonts w:ascii="Calibri" w:hAnsi="Calibri" w:cs="Calibri"/>
+          <w:lang w:val="en-CA" w:bidi="fa-IR"/>
+        </w:rPr>
+        <w:t xml:space="preserve">optionally writing fallback copies for debugging and validation. </w:t>
+      </w:r>
+    </w:p>
+    <w:p>
+      <w:pPr>
+        <w:rPr>
+          <w:rFonts w:ascii="Calibri" w:hAnsi="Calibri" w:cs="Calibri"/>
+          <w:lang w:val="en-CA" w:bidi="fa-IR"/>
+        </w:rPr>
+      </w:pPr>
+      <w:r>
+        <w:rPr>
+          <w:rFonts w:ascii="Calibri" w:hAnsi="Calibri" w:cs="Calibri"/>
+          <w:lang w:val="en-CA" w:bidi="fa-IR"/>
+        </w:rPr>
+        <w:t>This collector served as the ingestion boundary between the event-generating application layer and the streaming infrastructure.</w:t>
+      </w:r>
+    </w:p>
+    <w:p>
+      <w:pPr>
+        <w:rPr>
+          <w:rFonts w:ascii="Calibri" w:hAnsi="Calibri" w:cs="Calibri"/>
+          <w:b/>
+          <w:bCs/>
+          <w:lang w:val="en-CA" w:bidi="fa-IR"/>
+        </w:rPr>
+      </w:pPr>
+      <w:r>
+        <w:rPr>
+          <w:rFonts w:ascii="Calibri" w:hAnsi="Calibri" w:cs="Calibri"/>
+          <w:b/>
+          <w:bCs/>
+          <w:lang w:val="en-CA" w:bidi="fa-IR"/>
+        </w:rPr>
+        <w:t>Kafka Setup</w:t>
+      </w:r>
+    </w:p>
+    <w:p>
+      <w:pPr>
+        <w:rPr>
+          <w:rFonts w:ascii="Calibri" w:hAnsi="Calibri" w:cs="Calibri"/>
+          <w:lang w:val="en-CA" w:bidi="fa-IR"/>
+        </w:rPr>
+      </w:pPr>
+      <w:r>
+        <w:rPr>
+          <w:rFonts w:ascii="Calibri" w:hAnsi="Calibri" w:cs="Calibri"/>
+          <w:lang w:val="en-CA" w:bidi="fa-IR"/>
+        </w:rPr>
+        <w:t xml:space="preserve">After the collector was implemented, </w:t>
+      </w:r>
+      <w:r>
+        <w:rPr>
+          <w:rFonts w:ascii="Calibri" w:hAnsi="Calibri" w:cs="Calibri"/>
+          <w:b/>
+          <w:bCs/>
+          <w:lang w:val="en-CA" w:bidi="fa-IR"/>
+        </w:rPr>
+        <w:t>Kafka</w:t>
+      </w:r>
+      <w:r>
+        <w:rPr>
+          <w:rFonts w:ascii="Calibri" w:hAnsi="Calibri" w:cs="Calibri"/>
+          <w:lang w:val="en-CA" w:bidi="fa-IR"/>
+        </w:rPr>
+        <w:t xml:space="preserve"> was introduced as the event broker.</w:t>
+      </w:r>
+      <w:r>
+        <w:rPr>
+          <w:rFonts w:ascii="Calibri" w:hAnsi="Calibri" w:cs="Calibri"/>
+          <w:lang w:val="en-CA" w:bidi="fa-IR"/>
+        </w:rPr>
+        <w:br/>
+        <w:t>Kafka was used to decouple event production from downstream processing and to provide a reliable streaming buffer between the collector and analytics components.</w:t>
+      </w:r>
+    </w:p>
+    <w:p>
+      <w:pPr>
+        <w:rPr>
+          <w:rFonts w:ascii="Calibri" w:hAnsi="Calibri" w:cs="Calibri"/>
+          <w:lang w:val="en-CA" w:bidi="fa-IR"/>
+        </w:rPr>
+      </w:pPr>
+      <w:r>
+        <w:rPr>
+          <w:rFonts w:ascii="Calibri" w:hAnsi="Calibri" w:cs="Calibri"/>
+          <w:lang w:val="en-CA" w:bidi="fa-IR"/>
+        </w:rPr>
+        <w:t>A topic named user_events was created to store the clickstream records generated by the simulator and forwarded by the collector.</w:t>
+      </w:r>
+    </w:p>
+    <w:p>
+      <w:pPr>
+        <w:rPr>
+          <w:rFonts w:ascii="Calibri" w:hAnsi="Calibri" w:cs="Calibri"/>
+          <w:b/>
+          <w:bCs/>
+          <w:lang w:val="en-CA" w:bidi="fa-IR"/>
+        </w:rPr>
+      </w:pPr>
+      <w:r>
+        <w:rPr>
+          <w:rFonts w:ascii="Calibri" w:hAnsi="Calibri" w:cs="Calibri"/>
+          <w:b/>
+          <w:bCs/>
+          <w:lang w:val="en-CA" w:bidi="fa-IR"/>
+        </w:rPr>
+        <w:t>Spark Streaming Job</w:t>
+      </w:r>
+    </w:p>
+    <w:p>
+      <w:pPr>
+        <w:rPr>
+          <w:rFonts w:ascii="Calibri" w:hAnsi="Calibri" w:cs="Calibri"/>
+          <w:lang w:val="en-CA" w:bidi="fa-IR"/>
+        </w:rPr>
+      </w:pPr>
+      <w:r>
+        <w:rPr>
+          <w:rFonts w:ascii="Calibri" w:hAnsi="Calibri" w:cs="Calibri"/>
+          <w:lang w:val="en-CA" w:bidi="fa-IR"/>
+        </w:rPr>
+        <w:t>A Spark Structured Streaming job was then developed to consume data from the Kafka topic and write the raw events into the Bronze layer on MinIO.</w:t>
+      </w:r>
+      <w:r>
+        <w:rPr>
+          <w:rFonts w:ascii="Calibri" w:hAnsi="Calibri" w:cs="Calibri"/>
+          <w:lang w:val="en-CA" w:bidi="fa-IR"/>
+        </w:rPr>
+        <w:br/>
+        <w:t>This job performed the following tasks:</w:t>
+      </w:r>
+    </w:p>
+    <w:p>
+      <w:pPr>
+        <w:numPr>
+          <w:ilvl w:val="0"/>
+          <w:numId w:val="20"/>
+        </w:numPr>
+        <w:rPr>
+          <w:rFonts w:ascii="Calibri" w:hAnsi="Calibri" w:cs="Calibri"/>
+          <w:lang w:val="en-CA" w:bidi="fa-IR"/>
+        </w:rPr>
+      </w:pPr>
+      <w:r>
+        <w:rPr>
+          <w:rFonts w:ascii="Calibri" w:hAnsi="Calibri" w:cs="Calibri"/>
+          <w:lang w:val="en-CA" w:bidi="fa-IR"/>
+        </w:rPr>
+        <w:t xml:space="preserve">read events from Kafka, </w:t>
+      </w:r>
+    </w:p>
+    <w:p>
+      <w:pPr>
+        <w:numPr>
+          <w:ilvl w:val="0"/>
+          <w:numId w:val="20"/>
+        </w:numPr>
+        <w:rPr>
+          <w:rFonts w:ascii="Calibri" w:hAnsi="Calibri" w:cs="Calibri"/>
+          <w:lang w:val="en-CA" w:bidi="fa-IR"/>
+        </w:rPr>
+      </w:pPr>
+      <w:r>
+        <w:rPr>
+          <w:rFonts w:ascii="Calibri" w:hAnsi="Calibri" w:cs="Calibri"/>
+          <w:lang w:val="en-CA" w:bidi="fa-IR"/>
+        </w:rPr>
+        <w:t xml:space="preserve">preserve the raw JSON payload, </w:t>
+      </w:r>
+    </w:p>
+    <w:p>
+      <w:pPr>
+        <w:numPr>
+          <w:ilvl w:val="0"/>
+          <w:numId w:val="20"/>
+        </w:numPr>
+        <w:rPr>
+          <w:rFonts w:ascii="Calibri" w:hAnsi="Calibri" w:cs="Calibri"/>
+          <w:lang w:val="en-CA" w:bidi="fa-IR"/>
+        </w:rPr>
+      </w:pPr>
+      <w:r>
+        <w:rPr>
+          <w:rFonts w:ascii="Calibri" w:hAnsi="Calibri" w:cs="Calibri"/>
+          <w:lang w:val="en-CA" w:bidi="fa-IR"/>
+        </w:rPr>
+        <w:t xml:space="preserve">capture Kafka metadata such as topic, partition, offset, and timestamp, </w:t>
+      </w:r>
+    </w:p>
+    <w:p>
+      <w:pPr>
+        <w:numPr>
+          <w:ilvl w:val="0"/>
+          <w:numId w:val="20"/>
+        </w:numPr>
+        <w:rPr>
+          <w:rFonts w:ascii="Calibri" w:hAnsi="Calibri" w:cs="Calibri"/>
+          <w:lang w:val="en-CA" w:bidi="fa-IR"/>
+        </w:rPr>
+      </w:pPr>
+      <w:r>
+        <w:rPr>
+          <w:rFonts w:ascii="Calibri" w:hAnsi="Calibri" w:cs="Calibri"/>
+          <w:lang w:val="en-CA" w:bidi="fa-IR"/>
+        </w:rPr>
+        <w:t xml:space="preserve">extract a small set of useful fields for debugging and partitioning, </w:t>
+      </w:r>
+    </w:p>
+    <w:p>
+      <w:pPr>
+        <w:numPr>
+          <w:ilvl w:val="0"/>
+          <w:numId w:val="20"/>
+        </w:numPr>
+        <w:rPr>
+          <w:rFonts w:ascii="Calibri" w:hAnsi="Calibri" w:cs="Calibri"/>
+          <w:lang w:val="en-CA" w:bidi="fa-IR"/>
+        </w:rPr>
+      </w:pPr>
+      <w:r>
+        <w:rPr>
+          <w:rFonts w:ascii="Calibri" w:hAnsi="Calibri" w:cs="Calibri"/>
+          <w:lang w:val="en-CA" w:bidi="fa-IR"/>
+        </w:rPr>
+        <w:t xml:space="preserve">write the resulting dataset to the Bronze storage layer. </w:t>
+      </w:r>
+    </w:p>
+    <w:p>
+      <w:pPr>
+        <w:rPr>
+          <w:rFonts w:ascii="Calibri" w:hAnsi="Calibri" w:cs="Calibri"/>
+          <w:lang w:val="en-CA" w:bidi="fa-IR"/>
+        </w:rPr>
+      </w:pPr>
+      <w:r>
+        <w:rPr>
+          <w:rFonts w:ascii="Calibri" w:hAnsi="Calibri" w:cs="Calibri"/>
+          <w:lang w:val="en-CA" w:bidi="fa-IR"/>
+        </w:rPr>
+        <w:t>At this stage, the job was intentionally designed to keep the Bronze layer as raw and append-only as possible.</w:t>
+      </w:r>
+    </w:p>
+    <w:p>
+      <w:pPr>
+        <w:rPr>
+          <w:rFonts w:ascii="Calibri" w:hAnsi="Calibri" w:cs="Calibri"/>
+          <w:lang w:val="en-CA" w:bidi="fa-IR"/>
+        </w:rPr>
+      </w:pPr>
+    </w:p>
+    <w:p>
+      <w:pPr>
+        <w:rPr>
+          <w:rFonts w:ascii="Calibri" w:hAnsi="Calibri" w:cs="Calibri"/>
+          <w:lang w:val="en-CA" w:bidi="fa-IR"/>
+        </w:rPr>
+      </w:pPr>
+    </w:p>
+    <w:p>
+      <w:pPr>
+        <w:rPr>
+          <w:rFonts w:ascii="Calibri" w:hAnsi="Calibri" w:cs="Calibri"/>
+          <w:b/>
+          <w:bCs/>
+          <w:lang w:val="en-CA" w:bidi="fa-IR"/>
+        </w:rPr>
+      </w:pPr>
+      <w:r>
+        <w:rPr>
+          <w:rFonts w:ascii="Calibri" w:hAnsi="Calibri" w:cs="Calibri"/>
+          <w:b/>
+          <w:bCs/>
+          <w:lang w:val="en-CA" w:bidi="fa-IR"/>
+        </w:rPr>
+        <w:t>End-to-End Flow</w:t>
+      </w:r>
+    </w:p>
+    <w:p>
+      <w:pPr>
+        <w:rPr>
+          <w:rFonts w:ascii="Calibri" w:hAnsi="Calibri" w:cs="Calibri"/>
+          <w:lang w:val="en-CA" w:bidi="fa-IR"/>
+        </w:rPr>
+      </w:pPr>
+      <w:r>
+        <w:rPr>
+          <w:rFonts w:ascii="Calibri" w:hAnsi="Calibri" w:cs="Calibri"/>
+          <w:lang w:val="en-CA" w:bidi="fa-IR"/>
+        </w:rPr>
+        <w:t>The final data flow implemented in Phase 2 can be summarized as follows:</w:t>
+      </w:r>
+    </w:p>
+    <w:p>
+      <w:pPr>
+        <w:rPr>
+          <w:rFonts w:ascii="Calibri" w:hAnsi="Calibri" w:cs="Calibri"/>
+          <w:lang w:val="en-CA" w:bidi="fa-IR"/>
+        </w:rPr>
+      </w:pPr>
+    </w:p>
+    <w:p>
+      <w:pPr>
+        <w:rPr>
+          <w:rFonts w:ascii="Calibri" w:hAnsi="Calibri" w:cs="Calibri"/>
+          <w:lang w:val="en-CA" w:bidi="fa-IR"/>
+        </w:rPr>
+      </w:pPr>
+      <w:r>
+        <w:rPr>
+          <w:rFonts w:ascii="Calibri" w:hAnsi="Calibri" w:cs="Calibri"/>
+          <w:lang w:val="en-CA" w:bidi="fa-IR"/>
+        </w:rPr>
+        <w:t>Web Simulator -&gt; Collector -&gt; Kafka -&gt; Spark Structured Streaming -&gt; MinIO Bronze</w:t>
+      </w:r>
+    </w:p>
+    <w:p>
+      <w:pPr>
+        <w:rPr>
+          <w:rFonts w:ascii="Calibri" w:hAnsi="Calibri" w:cs="Calibri"/>
+          <w:lang w:val="en-CA" w:bidi="fa-IR"/>
+        </w:rPr>
+      </w:pPr>
+    </w:p>
+    <w:p>
+      <w:pPr>
+        <w:rPr>
+          <w:rFonts w:ascii="Calibri" w:hAnsi="Calibri" w:cs="Calibri"/>
+          <w:lang w:val="en-CA" w:bidi="fa-IR"/>
+        </w:rPr>
+      </w:pPr>
+      <w:r>
+        <w:rPr>
+          <w:rFonts w:ascii="Calibri" w:hAnsi="Calibri" w:cs="Calibri"/>
+          <w:lang w:val="en-CA" w:bidi="fa-IR"/>
+        </w:rPr>
+        <w:lastRenderedPageBreak/>
+        <w:t>Frontend / Backend / Cookie-context data</w:t>
+      </w:r>
+    </w:p>
+    <w:p>
+      <w:pPr>
+        <w:rPr>
+          <w:rFonts w:ascii="Calibri" w:hAnsi="Calibri" w:cs="Calibri"/>
+          <w:lang w:val="en-CA" w:bidi="fa-IR"/>
+        </w:rPr>
+      </w:pPr>
+      <w:r>
+        <w:rPr>
+          <w:rFonts w:ascii="Calibri" w:hAnsi="Calibri" w:cs="Calibri"/>
+          <w:lang w:val="en-CA" w:bidi="fa-IR"/>
+        </w:rPr>
+        <w:t xml:space="preserve">        -&gt; Web Simulator</w:t>
+      </w:r>
+    </w:p>
+    <w:p>
+      <w:pPr>
+        <w:rPr>
+          <w:rFonts w:ascii="Calibri" w:hAnsi="Calibri" w:cs="Calibri"/>
+          <w:lang w:val="en-CA" w:bidi="fa-IR"/>
+        </w:rPr>
+      </w:pPr>
+      <w:r>
+        <w:rPr>
+          <w:rFonts w:ascii="Calibri" w:hAnsi="Calibri" w:cs="Calibri"/>
+          <w:lang w:val="en-CA" w:bidi="fa-IR"/>
+        </w:rPr>
+        <w:t xml:space="preserve">        -&gt; Collector Application</w:t>
+      </w:r>
+    </w:p>
+    <w:p>
+      <w:pPr>
+        <w:rPr>
+          <w:rFonts w:ascii="Calibri" w:hAnsi="Calibri" w:cs="Calibri"/>
+          <w:lang w:val="en-CA" w:bidi="fa-IR"/>
+        </w:rPr>
+      </w:pPr>
+      <w:r>
+        <w:rPr>
+          <w:rFonts w:ascii="Calibri" w:hAnsi="Calibri" w:cs="Calibri"/>
+          <w:lang w:val="en-CA" w:bidi="fa-IR"/>
+        </w:rPr>
+        <w:t xml:space="preserve">        -&gt; Kafka topic (user_events)</w:t>
+      </w:r>
+    </w:p>
+    <w:p>
+      <w:pPr>
+        <w:rPr>
+          <w:rFonts w:ascii="Calibri" w:hAnsi="Calibri" w:cs="Calibri"/>
+          <w:lang w:val="en-CA" w:bidi="fa-IR"/>
+        </w:rPr>
+      </w:pPr>
+      <w:r>
+        <w:rPr>
+          <w:rFonts w:ascii="Calibri" w:hAnsi="Calibri" w:cs="Calibri"/>
+          <w:lang w:val="en-CA" w:bidi="fa-IR"/>
+        </w:rPr>
+        <w:t xml:space="preserve">        -&gt; Spark Streaming job</w:t>
+      </w:r>
+    </w:p>
+    <w:p>
+      <w:pPr>
+        <w:rPr>
+          <w:rFonts w:ascii="Calibri" w:hAnsi="Calibri" w:cs="Calibri"/>
+          <w:lang w:val="en-CA" w:bidi="fa-IR"/>
+        </w:rPr>
+      </w:pPr>
+      <w:r>
+        <w:rPr>
+          <w:rFonts w:ascii="Calibri" w:hAnsi="Calibri" w:cs="Calibri"/>
+          <w:lang w:val="en-CA" w:bidi="fa-IR"/>
+        </w:rPr>
+        <w:t xml:space="preserve">        -&gt; MinIO Bronze layer</w:t>
+      </w:r>
+    </w:p>
+    <w:p>
+      <w:pPr>
+        <w:rPr>
+          <w:rFonts w:ascii="Calibri" w:hAnsi="Calibri" w:cs="Calibri"/>
+          <w:lang w:val="en-CA" w:bidi="fa-IR"/>
+        </w:rPr>
+      </w:pPr>
+    </w:p>
+    <w:p>
+      <w:pPr>
+        <w:rPr>
+          <w:rFonts w:ascii="Calibri" w:hAnsi="Calibri" w:cs="Calibri"/>
+          <w:lang w:val="en-CA" w:bidi="fa-IR"/>
+        </w:rPr>
+      </w:pPr>
+      <w:r>
+        <w:rPr>
+          <w:rFonts w:ascii="Calibri" w:hAnsi="Calibri" w:cs="Calibri"/>
+          <w:lang w:val="en-CA" w:bidi="fa-IR"/>
+        </w:rPr>
+        <w:t>The main outcome of this phase was the successful implementation of a working clickstream ingestion pipeline.</w:t>
+      </w:r>
+      <w:r>
+        <w:rPr>
+          <w:rFonts w:ascii="Calibri" w:hAnsi="Calibri" w:cs="Calibri"/>
+          <w:lang w:val="en-CA" w:bidi="fa-IR"/>
+        </w:rPr>
+        <w:br/>
+        <w:t>This phase demonstrated that the platform could:</w:t>
+      </w:r>
+    </w:p>
+    <w:p>
+      <w:pPr>
+        <w:numPr>
+          <w:ilvl w:val="0"/>
+          <w:numId w:val="16"/>
+        </w:numPr>
+        <w:rPr>
+          <w:rFonts w:ascii="Calibri" w:hAnsi="Calibri" w:cs="Calibri"/>
+          <w:lang w:val="en-CA" w:bidi="fa-IR"/>
+        </w:rPr>
+      </w:pPr>
+      <w:r>
+        <w:rPr>
+          <w:rFonts w:ascii="Calibri" w:hAnsi="Calibri" w:cs="Calibri"/>
+          <w:lang w:val="en-CA" w:bidi="fa-IR"/>
+        </w:rPr>
+        <w:t xml:space="preserve">simulate realistic e-commerce interaction data, </w:t>
+      </w:r>
+    </w:p>
+    <w:p>
+      <w:pPr>
+        <w:numPr>
+          <w:ilvl w:val="0"/>
+          <w:numId w:val="16"/>
+        </w:numPr>
+        <w:rPr>
+          <w:rFonts w:ascii="Calibri" w:hAnsi="Calibri" w:cs="Calibri"/>
+          <w:lang w:val="en-CA" w:bidi="fa-IR"/>
+        </w:rPr>
+      </w:pPr>
+      <w:r>
+        <w:rPr>
+          <w:rFonts w:ascii="Calibri" w:hAnsi="Calibri" w:cs="Calibri"/>
+          <w:lang w:val="en-CA" w:bidi="fa-IR"/>
+        </w:rPr>
+        <w:t xml:space="preserve">collect events from multiple sources, </w:t>
+      </w:r>
+    </w:p>
+    <w:p>
+      <w:pPr>
+        <w:numPr>
+          <w:ilvl w:val="0"/>
+          <w:numId w:val="16"/>
+        </w:numPr>
+        <w:rPr>
+          <w:rFonts w:ascii="Calibri" w:hAnsi="Calibri" w:cs="Calibri"/>
+          <w:lang w:val="en-CA" w:bidi="fa-IR"/>
+        </w:rPr>
+      </w:pPr>
+      <w:r>
+        <w:rPr>
+          <w:rFonts w:ascii="Calibri" w:hAnsi="Calibri" w:cs="Calibri"/>
+          <w:lang w:val="en-CA" w:bidi="fa-IR"/>
+        </w:rPr>
+        <w:t xml:space="preserve">stream them through Kafka, </w:t>
+      </w:r>
+    </w:p>
+    <w:p>
+      <w:pPr>
+        <w:numPr>
+          <w:ilvl w:val="0"/>
+          <w:numId w:val="16"/>
+        </w:numPr>
+        <w:rPr>
+          <w:rFonts w:ascii="Calibri" w:hAnsi="Calibri" w:cs="Calibri"/>
+          <w:lang w:val="en-CA" w:bidi="fa-IR"/>
+        </w:rPr>
+      </w:pPr>
+      <w:r>
+        <w:rPr>
+          <w:rFonts w:ascii="Calibri" w:hAnsi="Calibri" w:cs="Calibri"/>
+          <w:lang w:val="en-CA" w:bidi="fa-IR"/>
+        </w:rPr>
+        <w:t xml:space="preserve">process them with Spark, </w:t>
+      </w:r>
+    </w:p>
+    <w:p>
+      <w:pPr>
+        <w:numPr>
+          <w:ilvl w:val="0"/>
+          <w:numId w:val="16"/>
+        </w:numPr>
+        <w:rPr>
+          <w:rFonts w:ascii="Calibri" w:hAnsi="Calibri" w:cs="Calibri"/>
+          <w:lang w:val="en-CA" w:bidi="fa-IR"/>
+        </w:rPr>
+      </w:pPr>
+      <w:r>
+        <w:rPr>
+          <w:rFonts w:ascii="Calibri" w:hAnsi="Calibri" w:cs="Calibri"/>
+          <w:lang w:val="en-CA" w:bidi="fa-IR"/>
+        </w:rPr>
+        <w:t xml:space="preserve">and persist them in the Bronze layer for downstream analytics. </w:t>
+      </w:r>
+    </w:p>
+    <w:p>
+      <w:pPr>
+        <w:rPr>
+          <w:rFonts w:ascii="Calibri" w:hAnsi="Calibri" w:cs="Calibri"/>
+          <w:lang w:val="en-CA" w:bidi="fa-IR"/>
+        </w:rPr>
+      </w:pPr>
+      <w:r>
+        <w:rPr>
+          <w:rFonts w:ascii="Calibri" w:hAnsi="Calibri" w:cs="Calibri"/>
+          <w:lang w:val="en-CA" w:bidi="fa-IR"/>
+        </w:rPr>
+        <w:t>This completed the first practical end-to-end streaming data flow in the platform and established the foundation for later Silver and Gold transformations, behavioral analytics, and recommendation-oriented processing.</w:t>
       </w:r>
     </w:p>
     <w:p>
@@ -8334,6 +9343,155 @@
     </w:lvl>
   </w:abstractNum>
   <w:abstractNum w:abstractNumId="3" w15:restartNumberingAfterBreak="0">
+    <w:nsid w:val="0C350877"/>
+    <w:multiLevelType w:val="multilevel"/>
+    <w:tmpl w:val="FF4A3EE4"/>
+    <w:lvl w:ilvl="0">
+      <w:start w:val="1"/>
+      <w:numFmt w:val="bullet"/>
+      <w:lvlText w:val=""/>
+      <w:lvlJc w:val="left"/>
+      <w:pPr>
+        <w:tabs>
+          <w:tab w:val="num" w:pos="720"/>
+        </w:tabs>
+        <w:ind w:left="720" w:hanging="360"/>
+      </w:pPr>
+      <w:rPr>
+        <w:rFonts w:ascii="Symbol" w:hAnsi="Symbol" w:hint="default"/>
+        <w:sz w:val="20"/>
+      </w:rPr>
+    </w:lvl>
+    <w:lvl w:ilvl="1" w:tentative="1">
+      <w:start w:val="1"/>
+      <w:numFmt w:val="bullet"/>
+      <w:lvlText w:val="o"/>
+      <w:lvlJc w:val="left"/>
+      <w:pPr>
+        <w:tabs>
+          <w:tab w:val="num" w:pos="1440"/>
+        </w:tabs>
+        <w:ind w:left="1440" w:hanging="360"/>
+      </w:pPr>
+      <w:rPr>
+        <w:rFonts w:ascii="Courier New" w:hAnsi="Courier New" w:hint="default"/>
+        <w:sz w:val="20"/>
+      </w:rPr>
+    </w:lvl>
+    <w:lvl w:ilvl="2" w:tentative="1">
+      <w:start w:val="1"/>
+      <w:numFmt w:val="bullet"/>
+      <w:lvlText w:val=""/>
+      <w:lvlJc w:val="left"/>
+      <w:pPr>
+        <w:tabs>
+          <w:tab w:val="num" w:pos="2160"/>
+        </w:tabs>
+        <w:ind w:left="2160" w:hanging="360"/>
+      </w:pPr>
+      <w:rPr>
+        <w:rFonts w:ascii="Wingdings" w:hAnsi="Wingdings" w:hint="default"/>
+        <w:sz w:val="20"/>
+      </w:rPr>
+    </w:lvl>
+    <w:lvl w:ilvl="3" w:tentative="1">
+      <w:start w:val="1"/>
+      <w:numFmt w:val="bullet"/>
+      <w:lvlText w:val=""/>
+      <w:lvlJc w:val="left"/>
+      <w:pPr>
+        <w:tabs>
+          <w:tab w:val="num" w:pos="2880"/>
+        </w:tabs>
+        <w:ind w:left="2880" w:hanging="360"/>
+      </w:pPr>
+      <w:rPr>
+        <w:rFonts w:ascii="Wingdings" w:hAnsi="Wingdings" w:hint="default"/>
+        <w:sz w:val="20"/>
+      </w:rPr>
+    </w:lvl>
+    <w:lvl w:ilvl="4" w:tentative="1">
+      <w:start w:val="1"/>
+      <w:numFmt w:val="bullet"/>
+      <w:lvlText w:val=""/>
+      <w:lvlJc w:val="left"/>
+      <w:pPr>
+        <w:tabs>
+          <w:tab w:val="num" w:pos="3600"/>
+        </w:tabs>
+        <w:ind w:left="3600" w:hanging="360"/>
+      </w:pPr>
+      <w:rPr>
+        <w:rFonts w:ascii="Wingdings" w:hAnsi="Wingdings" w:hint="default"/>
+        <w:sz w:val="20"/>
+      </w:rPr>
+    </w:lvl>
+    <w:lvl w:ilvl="5" w:tentative="1">
+      <w:start w:val="1"/>
+      <w:numFmt w:val="bullet"/>
+      <w:lvlText w:val=""/>
+      <w:lvlJc w:val="left"/>
+      <w:pPr>
+        <w:tabs>
+          <w:tab w:val="num" w:pos="4320"/>
+        </w:tabs>
+        <w:ind w:left="4320" w:hanging="360"/>
+      </w:pPr>
+      <w:rPr>
+        <w:rFonts w:ascii="Wingdings" w:hAnsi="Wingdings" w:hint="default"/>
+        <w:sz w:val="20"/>
+      </w:rPr>
+    </w:lvl>
+    <w:lvl w:ilvl="6" w:tentative="1">
+      <w:start w:val="1"/>
+      <w:numFmt w:val="bullet"/>
+      <w:lvlText w:val=""/>
+      <w:lvlJc w:val="left"/>
+      <w:pPr>
+        <w:tabs>
+          <w:tab w:val="num" w:pos="5040"/>
+        </w:tabs>
+        <w:ind w:left="5040" w:hanging="360"/>
+      </w:pPr>
+      <w:rPr>
+        <w:rFonts w:ascii="Wingdings" w:hAnsi="Wingdings" w:hint="default"/>
+        <w:sz w:val="20"/>
+      </w:rPr>
+    </w:lvl>
+    <w:lvl w:ilvl="7" w:tentative="1">
+      <w:start w:val="1"/>
+      <w:numFmt w:val="bullet"/>
+      <w:lvlText w:val=""/>
+      <w:lvlJc w:val="left"/>
+      <w:pPr>
+        <w:tabs>
+          <w:tab w:val="num" w:pos="5760"/>
+        </w:tabs>
+        <w:ind w:left="5760" w:hanging="360"/>
+      </w:pPr>
+      <w:rPr>
+        <w:rFonts w:ascii="Wingdings" w:hAnsi="Wingdings" w:hint="default"/>
+        <w:sz w:val="20"/>
+      </w:rPr>
+    </w:lvl>
+    <w:lvl w:ilvl="8" w:tentative="1">
+      <w:start w:val="1"/>
+      <w:numFmt w:val="bullet"/>
+      <w:lvlText w:val=""/>
+      <w:lvlJc w:val="left"/>
+      <w:pPr>
+        <w:tabs>
+          <w:tab w:val="num" w:pos="6480"/>
+        </w:tabs>
+        <w:ind w:left="6480" w:hanging="360"/>
+      </w:pPr>
+      <w:rPr>
+        <w:rFonts w:ascii="Wingdings" w:hAnsi="Wingdings" w:hint="default"/>
+        <w:sz w:val="20"/>
+      </w:rPr>
+    </w:lvl>
+  </w:abstractNum>
+  <w:abstractNum w:abstractNumId="4" w15:restartNumberingAfterBreak="0">
     <w:nsid w:val="0D7329D4"/>
     <w:multiLevelType w:val="multilevel"/>
     <w:tmpl w:val="A5508618"/>
@@ -8446,7 +9604,7 @@
       </w:pPr>
     </w:lvl>
   </w:abstractNum>
-  <w:abstractNum w:abstractNumId="4" w15:restartNumberingAfterBreak="0">
+  <w:abstractNum w:abstractNumId="5" w15:restartNumberingAfterBreak="0">
     <w:nsid w:val="0F5147E1"/>
     <w:multiLevelType w:val="hybridMultilevel"/>
     <w:tmpl w:val="89F623C0"/>
@@ -8559,7 +9717,156 @@
       </w:rPr>
     </w:lvl>
   </w:abstractNum>
-  <w:abstractNum w:abstractNumId="5" w15:restartNumberingAfterBreak="0">
+  <w:abstractNum w:abstractNumId="6" w15:restartNumberingAfterBreak="0">
+    <w:nsid w:val="172763FE"/>
+    <w:multiLevelType w:val="multilevel"/>
+    <w:tmpl w:val="8AB604EE"/>
+    <w:lvl w:ilvl="0">
+      <w:start w:val="1"/>
+      <w:numFmt w:val="bullet"/>
+      <w:lvlText w:val=""/>
+      <w:lvlJc w:val="left"/>
+      <w:pPr>
+        <w:tabs>
+          <w:tab w:val="num" w:pos="720"/>
+        </w:tabs>
+        <w:ind w:left="720" w:hanging="360"/>
+      </w:pPr>
+      <w:rPr>
+        <w:rFonts w:ascii="Symbol" w:hAnsi="Symbol" w:hint="default"/>
+        <w:sz w:val="20"/>
+      </w:rPr>
+    </w:lvl>
+    <w:lvl w:ilvl="1" w:tentative="1">
+      <w:start w:val="1"/>
+      <w:numFmt w:val="bullet"/>
+      <w:lvlText w:val="o"/>
+      <w:lvlJc w:val="left"/>
+      <w:pPr>
+        <w:tabs>
+          <w:tab w:val="num" w:pos="1440"/>
+        </w:tabs>
+        <w:ind w:left="1440" w:hanging="360"/>
+      </w:pPr>
+      <w:rPr>
+        <w:rFonts w:ascii="Courier New" w:hAnsi="Courier New" w:hint="default"/>
+        <w:sz w:val="20"/>
+      </w:rPr>
+    </w:lvl>
+    <w:lvl w:ilvl="2" w:tentative="1">
+      <w:start w:val="1"/>
+      <w:numFmt w:val="bullet"/>
+      <w:lvlText w:val=""/>
+      <w:lvlJc w:val="left"/>
+      <w:pPr>
+        <w:tabs>
+          <w:tab w:val="num" w:pos="2160"/>
+        </w:tabs>
+        <w:ind w:left="2160" w:hanging="360"/>
+      </w:pPr>
+      <w:rPr>
+        <w:rFonts w:ascii="Wingdings" w:hAnsi="Wingdings" w:hint="default"/>
+        <w:sz w:val="20"/>
+      </w:rPr>
+    </w:lvl>
+    <w:lvl w:ilvl="3" w:tentative="1">
+      <w:start w:val="1"/>
+      <w:numFmt w:val="bullet"/>
+      <w:lvlText w:val=""/>
+      <w:lvlJc w:val="left"/>
+      <w:pPr>
+        <w:tabs>
+          <w:tab w:val="num" w:pos="2880"/>
+        </w:tabs>
+        <w:ind w:left="2880" w:hanging="360"/>
+      </w:pPr>
+      <w:rPr>
+        <w:rFonts w:ascii="Wingdings" w:hAnsi="Wingdings" w:hint="default"/>
+        <w:sz w:val="20"/>
+      </w:rPr>
+    </w:lvl>
+    <w:lvl w:ilvl="4" w:tentative="1">
+      <w:start w:val="1"/>
+      <w:numFmt w:val="bullet"/>
+      <w:lvlText w:val=""/>
+      <w:lvlJc w:val="left"/>
+      <w:pPr>
+        <w:tabs>
+          <w:tab w:val="num" w:pos="3600"/>
+        </w:tabs>
+        <w:ind w:left="3600" w:hanging="360"/>
+      </w:pPr>
+      <w:rPr>
+        <w:rFonts w:ascii="Wingdings" w:hAnsi="Wingdings" w:hint="default"/>
+        <w:sz w:val="20"/>
+      </w:rPr>
+    </w:lvl>
+    <w:lvl w:ilvl="5" w:tentative="1">
+      <w:start w:val="1"/>
+      <w:numFmt w:val="bullet"/>
+      <w:lvlText w:val=""/>
+      <w:lvlJc w:val="left"/>
+      <w:pPr>
+        <w:tabs>
+          <w:tab w:val="num" w:pos="4320"/>
+        </w:tabs>
+        <w:ind w:left="4320" w:hanging="360"/>
+      </w:pPr>
+      <w:rPr>
+        <w:rFonts w:ascii="Wingdings" w:hAnsi="Wingdings" w:hint="default"/>
+        <w:sz w:val="20"/>
+      </w:rPr>
+    </w:lvl>
+    <w:lvl w:ilvl="6" w:tentative="1">
+      <w:start w:val="1"/>
+      <w:numFmt w:val="bullet"/>
+      <w:lvlText w:val=""/>
+      <w:lvlJc w:val="left"/>
+      <w:pPr>
+        <w:tabs>
+          <w:tab w:val="num" w:pos="5040"/>
+        </w:tabs>
+        <w:ind w:left="5040" w:hanging="360"/>
+      </w:pPr>
+      <w:rPr>
+        <w:rFonts w:ascii="Wingdings" w:hAnsi="Wingdings" w:hint="default"/>
+        <w:sz w:val="20"/>
+      </w:rPr>
+    </w:lvl>
+    <w:lvl w:ilvl="7" w:tentative="1">
+      <w:start w:val="1"/>
+      <w:numFmt w:val="bullet"/>
+      <w:lvlText w:val=""/>
+      <w:lvlJc w:val="left"/>
+      <w:pPr>
+        <w:tabs>
+          <w:tab w:val="num" w:pos="5760"/>
+        </w:tabs>
+        <w:ind w:left="5760" w:hanging="360"/>
+      </w:pPr>
+      <w:rPr>
+        <w:rFonts w:ascii="Wingdings" w:hAnsi="Wingdings" w:hint="default"/>
+        <w:sz w:val="20"/>
+      </w:rPr>
+    </w:lvl>
+    <w:lvl w:ilvl="8" w:tentative="1">
+      <w:start w:val="1"/>
+      <w:numFmt w:val="bullet"/>
+      <w:lvlText w:val=""/>
+      <w:lvlJc w:val="left"/>
+      <w:pPr>
+        <w:tabs>
+          <w:tab w:val="num" w:pos="6480"/>
+        </w:tabs>
+        <w:ind w:left="6480" w:hanging="360"/>
+      </w:pPr>
+      <w:rPr>
+        <w:rFonts w:ascii="Wingdings" w:hAnsi="Wingdings" w:hint="default"/>
+        <w:sz w:val="20"/>
+      </w:rPr>
+    </w:lvl>
+  </w:abstractNum>
+  <w:abstractNum w:abstractNumId="7" w15:restartNumberingAfterBreak="0">
     <w:nsid w:val="1902203F"/>
     <w:multiLevelType w:val="multilevel"/>
     <w:tmpl w:val="7A0A3274"/>
@@ -8672,7 +9979,7 @@
       </w:pPr>
     </w:lvl>
   </w:abstractNum>
-  <w:abstractNum w:abstractNumId="6" w15:restartNumberingAfterBreak="0">
+  <w:abstractNum w:abstractNumId="8" w15:restartNumberingAfterBreak="0">
     <w:nsid w:val="245F0AD4"/>
     <w:multiLevelType w:val="multilevel"/>
     <w:tmpl w:val="323EE104"/>
@@ -8821,7 +10128,7 @@
       </w:rPr>
     </w:lvl>
   </w:abstractNum>
-  <w:abstractNum w:abstractNumId="7" w15:restartNumberingAfterBreak="0">
+  <w:abstractNum w:abstractNumId="9" w15:restartNumberingAfterBreak="0">
     <w:nsid w:val="2F3822AC"/>
     <w:multiLevelType w:val="multilevel"/>
     <w:tmpl w:val="D242CACC"/>
@@ -8970,7 +10277,120 @@
       </w:rPr>
     </w:lvl>
   </w:abstractNum>
-  <w:abstractNum w:abstractNumId="8" w15:restartNumberingAfterBreak="0">
+  <w:abstractNum w:abstractNumId="10" w15:restartNumberingAfterBreak="0">
+    <w:nsid w:val="33742DF3"/>
+    <w:multiLevelType w:val="multilevel"/>
+    <w:tmpl w:val="DBE204AA"/>
+    <w:lvl w:ilvl="0">
+      <w:start w:val="1"/>
+      <w:numFmt w:val="decimal"/>
+      <w:lvlText w:val="%1."/>
+      <w:lvlJc w:val="left"/>
+      <w:pPr>
+        <w:tabs>
+          <w:tab w:val="num" w:pos="720"/>
+        </w:tabs>
+        <w:ind w:left="720" w:hanging="360"/>
+      </w:pPr>
+    </w:lvl>
+    <w:lvl w:ilvl="1" w:tentative="1">
+      <w:start w:val="1"/>
+      <w:numFmt w:val="decimal"/>
+      <w:lvlText w:val="%2."/>
+      <w:lvlJc w:val="left"/>
+      <w:pPr>
+        <w:tabs>
+          <w:tab w:val="num" w:pos="1440"/>
+        </w:tabs>
+        <w:ind w:left="1440" w:hanging="360"/>
+      </w:pPr>
+    </w:lvl>
+    <w:lvl w:ilvl="2" w:tentative="1">
+      <w:start w:val="1"/>
+      <w:numFmt w:val="decimal"/>
+      <w:lvlText w:val="%3."/>
+      <w:lvlJc w:val="left"/>
+      <w:pPr>
+        <w:tabs>
+          <w:tab w:val="num" w:pos="2160"/>
+        </w:tabs>
+        <w:ind w:left="2160" w:hanging="360"/>
+      </w:pPr>
+    </w:lvl>
+    <w:lvl w:ilvl="3" w:tentative="1">
+      <w:start w:val="1"/>
+      <w:numFmt w:val="decimal"/>
+      <w:lvlText w:val="%4."/>
+      <w:lvlJc w:val="left"/>
+      <w:pPr>
+        <w:tabs>
+          <w:tab w:val="num" w:pos="2880"/>
+        </w:tabs>
+        <w:ind w:left="2880" w:hanging="360"/>
+      </w:pPr>
+    </w:lvl>
+    <w:lvl w:ilvl="4" w:tentative="1">
+      <w:start w:val="1"/>
+      <w:numFmt w:val="decimal"/>
+      <w:lvlText w:val="%5."/>
+      <w:lvlJc w:val="left"/>
+      <w:pPr>
+        <w:tabs>
+          <w:tab w:val="num" w:pos="3600"/>
+        </w:tabs>
+        <w:ind w:left="3600" w:hanging="360"/>
+      </w:pPr>
+    </w:lvl>
+    <w:lvl w:ilvl="5" w:tentative="1">
+      <w:start w:val="1"/>
+      <w:numFmt w:val="decimal"/>
+      <w:lvlText w:val="%6."/>
+      <w:lvlJc w:val="left"/>
+      <w:pPr>
+        <w:tabs>
+          <w:tab w:val="num" w:pos="4320"/>
+        </w:tabs>
+        <w:ind w:left="4320" w:hanging="360"/>
+      </w:pPr>
+    </w:lvl>
+    <w:lvl w:ilvl="6" w:tentative="1">
+      <w:start w:val="1"/>
+      <w:numFmt w:val="decimal"/>
+      <w:lvlText w:val="%7."/>
+      <w:lvlJc w:val="left"/>
+      <w:pPr>
+        <w:tabs>
+          <w:tab w:val="num" w:pos="5040"/>
+        </w:tabs>
+        <w:ind w:left="5040" w:hanging="360"/>
+      </w:pPr>
+    </w:lvl>
+    <w:lvl w:ilvl="7" w:tentative="1">
+      <w:start w:val="1"/>
+      <w:numFmt w:val="decimal"/>
+      <w:lvlText w:val="%8."/>
+      <w:lvlJc w:val="left"/>
+      <w:pPr>
+        <w:tabs>
+          <w:tab w:val="num" w:pos="5760"/>
+        </w:tabs>
+        <w:ind w:left="5760" w:hanging="360"/>
+      </w:pPr>
+    </w:lvl>
+    <w:lvl w:ilvl="8" w:tentative="1">
+      <w:start w:val="1"/>
+      <w:numFmt w:val="decimal"/>
+      <w:lvlText w:val="%9."/>
+      <w:lvlJc w:val="left"/>
+      <w:pPr>
+        <w:tabs>
+          <w:tab w:val="num" w:pos="6480"/>
+        </w:tabs>
+        <w:ind w:left="6480" w:hanging="360"/>
+      </w:pPr>
+    </w:lvl>
+  </w:abstractNum>
+  <w:abstractNum w:abstractNumId="11" w15:restartNumberingAfterBreak="0">
     <w:nsid w:val="3691289A"/>
     <w:multiLevelType w:val="multilevel"/>
     <w:tmpl w:val="D004BC62"/>
@@ -9119,7 +10539,156 @@
       </w:rPr>
     </w:lvl>
   </w:abstractNum>
-  <w:abstractNum w:abstractNumId="9" w15:restartNumberingAfterBreak="0">
+  <w:abstractNum w:abstractNumId="12" w15:restartNumberingAfterBreak="0">
+    <w:nsid w:val="3D716497"/>
+    <w:multiLevelType w:val="multilevel"/>
+    <w:tmpl w:val="A8460138"/>
+    <w:lvl w:ilvl="0">
+      <w:start w:val="1"/>
+      <w:numFmt w:val="bullet"/>
+      <w:lvlText w:val=""/>
+      <w:lvlJc w:val="left"/>
+      <w:pPr>
+        <w:tabs>
+          <w:tab w:val="num" w:pos="720"/>
+        </w:tabs>
+        <w:ind w:left="720" w:hanging="360"/>
+      </w:pPr>
+      <w:rPr>
+        <w:rFonts w:ascii="Symbol" w:hAnsi="Symbol" w:hint="default"/>
+        <w:sz w:val="20"/>
+      </w:rPr>
+    </w:lvl>
+    <w:lvl w:ilvl="1" w:tentative="1">
+      <w:start w:val="1"/>
+      <w:numFmt w:val="bullet"/>
+      <w:lvlText w:val="o"/>
+      <w:lvlJc w:val="left"/>
+      <w:pPr>
+        <w:tabs>
+          <w:tab w:val="num" w:pos="1440"/>
+        </w:tabs>
+        <w:ind w:left="1440" w:hanging="360"/>
+      </w:pPr>
+      <w:rPr>
+        <w:rFonts w:ascii="Courier New" w:hAnsi="Courier New" w:hint="default"/>
+        <w:sz w:val="20"/>
+      </w:rPr>
+    </w:lvl>
+    <w:lvl w:ilvl="2" w:tentative="1">
+      <w:start w:val="1"/>
+      <w:numFmt w:val="bullet"/>
+      <w:lvlText w:val=""/>
+      <w:lvlJc w:val="left"/>
+      <w:pPr>
+        <w:tabs>
+          <w:tab w:val="num" w:pos="2160"/>
+        </w:tabs>
+        <w:ind w:left="2160" w:hanging="360"/>
+      </w:pPr>
+      <w:rPr>
+        <w:rFonts w:ascii="Wingdings" w:hAnsi="Wingdings" w:hint="default"/>
+        <w:sz w:val="20"/>
+      </w:rPr>
+    </w:lvl>
+    <w:lvl w:ilvl="3" w:tentative="1">
+      <w:start w:val="1"/>
+      <w:numFmt w:val="bullet"/>
+      <w:lvlText w:val=""/>
+      <w:lvlJc w:val="left"/>
+      <w:pPr>
+        <w:tabs>
+          <w:tab w:val="num" w:pos="2880"/>
+        </w:tabs>
+        <w:ind w:left="2880" w:hanging="360"/>
+      </w:pPr>
+      <w:rPr>
+        <w:rFonts w:ascii="Wingdings" w:hAnsi="Wingdings" w:hint="default"/>
+        <w:sz w:val="20"/>
+      </w:rPr>
+    </w:lvl>
+    <w:lvl w:ilvl="4" w:tentative="1">
+      <w:start w:val="1"/>
+      <w:numFmt w:val="bullet"/>
+      <w:lvlText w:val=""/>
+      <w:lvlJc w:val="left"/>
+      <w:pPr>
+        <w:tabs>
+          <w:tab w:val="num" w:pos="3600"/>
+        </w:tabs>
+        <w:ind w:left="3600" w:hanging="360"/>
+      </w:pPr>
+      <w:rPr>
+        <w:rFonts w:ascii="Wingdings" w:hAnsi="Wingdings" w:hint="default"/>
+        <w:sz w:val="20"/>
+      </w:rPr>
+    </w:lvl>
+    <w:lvl w:ilvl="5" w:tentative="1">
+      <w:start w:val="1"/>
+      <w:numFmt w:val="bullet"/>
+      <w:lvlText w:val=""/>
+      <w:lvlJc w:val="left"/>
+      <w:pPr>
+        <w:tabs>
+          <w:tab w:val="num" w:pos="4320"/>
+        </w:tabs>
+        <w:ind w:left="4320" w:hanging="360"/>
+      </w:pPr>
+      <w:rPr>
+        <w:rFonts w:ascii="Wingdings" w:hAnsi="Wingdings" w:hint="default"/>
+        <w:sz w:val="20"/>
+      </w:rPr>
+    </w:lvl>
+    <w:lvl w:ilvl="6" w:tentative="1">
+      <w:start w:val="1"/>
+      <w:numFmt w:val="bullet"/>
+      <w:lvlText w:val=""/>
+      <w:lvlJc w:val="left"/>
+      <w:pPr>
+        <w:tabs>
+          <w:tab w:val="num" w:pos="5040"/>
+        </w:tabs>
+        <w:ind w:left="5040" w:hanging="360"/>
+      </w:pPr>
+      <w:rPr>
+        <w:rFonts w:ascii="Wingdings" w:hAnsi="Wingdings" w:hint="default"/>
+        <w:sz w:val="20"/>
+      </w:rPr>
+    </w:lvl>
+    <w:lvl w:ilvl="7" w:tentative="1">
+      <w:start w:val="1"/>
+      <w:numFmt w:val="bullet"/>
+      <w:lvlText w:val=""/>
+      <w:lvlJc w:val="left"/>
+      <w:pPr>
+        <w:tabs>
+          <w:tab w:val="num" w:pos="5760"/>
+        </w:tabs>
+        <w:ind w:left="5760" w:hanging="360"/>
+      </w:pPr>
+      <w:rPr>
+        <w:rFonts w:ascii="Wingdings" w:hAnsi="Wingdings" w:hint="default"/>
+        <w:sz w:val="20"/>
+      </w:rPr>
+    </w:lvl>
+    <w:lvl w:ilvl="8" w:tentative="1">
+      <w:start w:val="1"/>
+      <w:numFmt w:val="bullet"/>
+      <w:lvlText w:val=""/>
+      <w:lvlJc w:val="left"/>
+      <w:pPr>
+        <w:tabs>
+          <w:tab w:val="num" w:pos="6480"/>
+        </w:tabs>
+        <w:ind w:left="6480" w:hanging="360"/>
+      </w:pPr>
+      <w:rPr>
+        <w:rFonts w:ascii="Wingdings" w:hAnsi="Wingdings" w:hint="default"/>
+        <w:sz w:val="20"/>
+      </w:rPr>
+    </w:lvl>
+  </w:abstractNum>
+  <w:abstractNum w:abstractNumId="13" w15:restartNumberingAfterBreak="0">
     <w:nsid w:val="59FB424E"/>
     <w:multiLevelType w:val="multilevel"/>
     <w:tmpl w:val="C4D25A0A"/>
@@ -9268,7 +10837,7 @@
       </w:rPr>
     </w:lvl>
   </w:abstractNum>
-  <w:abstractNum w:abstractNumId="10" w15:restartNumberingAfterBreak="0">
+  <w:abstractNum w:abstractNumId="14" w15:restartNumberingAfterBreak="0">
     <w:nsid w:val="6D0355CE"/>
     <w:multiLevelType w:val="multilevel"/>
     <w:tmpl w:val="358CA1D4"/>
@@ -9417,7 +10986,7 @@
       </w:rPr>
     </w:lvl>
   </w:abstractNum>
-  <w:abstractNum w:abstractNumId="11" w15:restartNumberingAfterBreak="0">
+  <w:abstractNum w:abstractNumId="15" w15:restartNumberingAfterBreak="0">
     <w:nsid w:val="6EB26271"/>
     <w:multiLevelType w:val="multilevel"/>
     <w:tmpl w:val="A5F053BA"/>
@@ -9566,7 +11135,7 @@
       </w:rPr>
     </w:lvl>
   </w:abstractNum>
-  <w:abstractNum w:abstractNumId="12" w15:restartNumberingAfterBreak="0">
+  <w:abstractNum w:abstractNumId="16" w15:restartNumberingAfterBreak="0">
     <w:nsid w:val="6F2B1F8A"/>
     <w:multiLevelType w:val="multilevel"/>
     <w:tmpl w:val="6BC4B4A8"/>
@@ -9715,7 +11284,156 @@
       </w:rPr>
     </w:lvl>
   </w:abstractNum>
-  <w:abstractNum w:abstractNumId="13" w15:restartNumberingAfterBreak="0">
+  <w:abstractNum w:abstractNumId="17" w15:restartNumberingAfterBreak="0">
+    <w:nsid w:val="6F9C7D79"/>
+    <w:multiLevelType w:val="multilevel"/>
+    <w:tmpl w:val="9DD0B274"/>
+    <w:lvl w:ilvl="0">
+      <w:start w:val="1"/>
+      <w:numFmt w:val="bullet"/>
+      <w:lvlText w:val=""/>
+      <w:lvlJc w:val="left"/>
+      <w:pPr>
+        <w:tabs>
+          <w:tab w:val="num" w:pos="720"/>
+        </w:tabs>
+        <w:ind w:left="720" w:hanging="360"/>
+      </w:pPr>
+      <w:rPr>
+        <w:rFonts w:ascii="Symbol" w:hAnsi="Symbol" w:hint="default"/>
+        <w:sz w:val="20"/>
+      </w:rPr>
+    </w:lvl>
+    <w:lvl w:ilvl="1" w:tentative="1">
+      <w:start w:val="1"/>
+      <w:numFmt w:val="bullet"/>
+      <w:lvlText w:val="o"/>
+      <w:lvlJc w:val="left"/>
+      <w:pPr>
+        <w:tabs>
+          <w:tab w:val="num" w:pos="1440"/>
+        </w:tabs>
+        <w:ind w:left="1440" w:hanging="360"/>
+      </w:pPr>
+      <w:rPr>
+        <w:rFonts w:ascii="Courier New" w:hAnsi="Courier New" w:hint="default"/>
+        <w:sz w:val="20"/>
+      </w:rPr>
+    </w:lvl>
+    <w:lvl w:ilvl="2" w:tentative="1">
+      <w:start w:val="1"/>
+      <w:numFmt w:val="bullet"/>
+      <w:lvlText w:val=""/>
+      <w:lvlJc w:val="left"/>
+      <w:pPr>
+        <w:tabs>
+          <w:tab w:val="num" w:pos="2160"/>
+        </w:tabs>
+        <w:ind w:left="2160" w:hanging="360"/>
+      </w:pPr>
+      <w:rPr>
+        <w:rFonts w:ascii="Wingdings" w:hAnsi="Wingdings" w:hint="default"/>
+        <w:sz w:val="20"/>
+      </w:rPr>
+    </w:lvl>
+    <w:lvl w:ilvl="3" w:tentative="1">
+      <w:start w:val="1"/>
+      <w:numFmt w:val="bullet"/>
+      <w:lvlText w:val=""/>
+      <w:lvlJc w:val="left"/>
+      <w:pPr>
+        <w:tabs>
+          <w:tab w:val="num" w:pos="2880"/>
+        </w:tabs>
+        <w:ind w:left="2880" w:hanging="360"/>
+      </w:pPr>
+      <w:rPr>
+        <w:rFonts w:ascii="Wingdings" w:hAnsi="Wingdings" w:hint="default"/>
+        <w:sz w:val="20"/>
+      </w:rPr>
+    </w:lvl>
+    <w:lvl w:ilvl="4" w:tentative="1">
+      <w:start w:val="1"/>
+      <w:numFmt w:val="bullet"/>
+      <w:lvlText w:val=""/>
+      <w:lvlJc w:val="left"/>
+      <w:pPr>
+        <w:tabs>
+          <w:tab w:val="num" w:pos="3600"/>
+        </w:tabs>
+        <w:ind w:left="3600" w:hanging="360"/>
+      </w:pPr>
+      <w:rPr>
+        <w:rFonts w:ascii="Wingdings" w:hAnsi="Wingdings" w:hint="default"/>
+        <w:sz w:val="20"/>
+      </w:rPr>
+    </w:lvl>
+    <w:lvl w:ilvl="5" w:tentative="1">
+      <w:start w:val="1"/>
+      <w:numFmt w:val="bullet"/>
+      <w:lvlText w:val=""/>
+      <w:lvlJc w:val="left"/>
+      <w:pPr>
+        <w:tabs>
+          <w:tab w:val="num" w:pos="4320"/>
+        </w:tabs>
+        <w:ind w:left="4320" w:hanging="360"/>
+      </w:pPr>
+      <w:rPr>
+        <w:rFonts w:ascii="Wingdings" w:hAnsi="Wingdings" w:hint="default"/>
+        <w:sz w:val="20"/>
+      </w:rPr>
+    </w:lvl>
+    <w:lvl w:ilvl="6" w:tentative="1">
+      <w:start w:val="1"/>
+      <w:numFmt w:val="bullet"/>
+      <w:lvlText w:val=""/>
+      <w:lvlJc w:val="left"/>
+      <w:pPr>
+        <w:tabs>
+          <w:tab w:val="num" w:pos="5040"/>
+        </w:tabs>
+        <w:ind w:left="5040" w:hanging="360"/>
+      </w:pPr>
+      <w:rPr>
+        <w:rFonts w:ascii="Wingdings" w:hAnsi="Wingdings" w:hint="default"/>
+        <w:sz w:val="20"/>
+      </w:rPr>
+    </w:lvl>
+    <w:lvl w:ilvl="7" w:tentative="1">
+      <w:start w:val="1"/>
+      <w:numFmt w:val="bullet"/>
+      <w:lvlText w:val=""/>
+      <w:lvlJc w:val="left"/>
+      <w:pPr>
+        <w:tabs>
+          <w:tab w:val="num" w:pos="5760"/>
+        </w:tabs>
+        <w:ind w:left="5760" w:hanging="360"/>
+      </w:pPr>
+      <w:rPr>
+        <w:rFonts w:ascii="Wingdings" w:hAnsi="Wingdings" w:hint="default"/>
+        <w:sz w:val="20"/>
+      </w:rPr>
+    </w:lvl>
+    <w:lvl w:ilvl="8" w:tentative="1">
+      <w:start w:val="1"/>
+      <w:numFmt w:val="bullet"/>
+      <w:lvlText w:val=""/>
+      <w:lvlJc w:val="left"/>
+      <w:pPr>
+        <w:tabs>
+          <w:tab w:val="num" w:pos="6480"/>
+        </w:tabs>
+        <w:ind w:left="6480" w:hanging="360"/>
+      </w:pPr>
+      <w:rPr>
+        <w:rFonts w:ascii="Wingdings" w:hAnsi="Wingdings" w:hint="default"/>
+        <w:sz w:val="20"/>
+      </w:rPr>
+    </w:lvl>
+  </w:abstractNum>
+  <w:abstractNum w:abstractNumId="18" w15:restartNumberingAfterBreak="0">
     <w:nsid w:val="76241424"/>
     <w:multiLevelType w:val="multilevel"/>
     <w:tmpl w:val="DC1248EC"/>
@@ -9864,7 +11582,7 @@
       </w:rPr>
     </w:lvl>
   </w:abstractNum>
-  <w:abstractNum w:abstractNumId="14" w15:restartNumberingAfterBreak="0">
+  <w:abstractNum w:abstractNumId="19" w15:restartNumberingAfterBreak="0">
     <w:nsid w:val="7D824646"/>
     <w:multiLevelType w:val="multilevel"/>
     <w:tmpl w:val="4E50C6CA"/>
@@ -10014,49 +11732,64 @@
     </w:lvl>
   </w:abstractNum>
   <w:num w:numId="1" w16cid:durableId="1909805537">
-    <w:abstractNumId w:val="13"/>
+    <w:abstractNumId w:val="18"/>
   </w:num>
   <w:num w:numId="2" w16cid:durableId="1897351069">
-    <w:abstractNumId w:val="10"/>
+    <w:abstractNumId w:val="14"/>
   </w:num>
   <w:num w:numId="3" w16cid:durableId="2006978503">
     <w:abstractNumId w:val="0"/>
   </w:num>
   <w:num w:numId="4" w16cid:durableId="272858418">
-    <w:abstractNumId w:val="12"/>
+    <w:abstractNumId w:val="16"/>
   </w:num>
   <w:num w:numId="5" w16cid:durableId="1068264766">
-    <w:abstractNumId w:val="7"/>
+    <w:abstractNumId w:val="9"/>
   </w:num>
   <w:num w:numId="6" w16cid:durableId="1944796440">
-    <w:abstractNumId w:val="6"/>
+    <w:abstractNumId w:val="8"/>
   </w:num>
   <w:num w:numId="7" w16cid:durableId="2027554167">
-    <w:abstractNumId w:val="14"/>
+    <w:abstractNumId w:val="19"/>
   </w:num>
   <w:num w:numId="8" w16cid:durableId="1208688926">
-    <w:abstractNumId w:val="9"/>
+    <w:abstractNumId w:val="13"/>
   </w:num>
   <w:num w:numId="9" w16cid:durableId="1357316145">
-    <w:abstractNumId w:val="8"/>
+    <w:abstractNumId w:val="11"/>
   </w:num>
   <w:num w:numId="10" w16cid:durableId="218397137">
     <w:abstractNumId w:val="1"/>
   </w:num>
   <w:num w:numId="11" w16cid:durableId="1789885103">
-    <w:abstractNumId w:val="5"/>
+    <w:abstractNumId w:val="7"/>
   </w:num>
   <w:num w:numId="12" w16cid:durableId="778530499">
-    <w:abstractNumId w:val="11"/>
+    <w:abstractNumId w:val="15"/>
   </w:num>
   <w:num w:numId="13" w16cid:durableId="1560049195">
-    <w:abstractNumId w:val="3"/>
+    <w:abstractNumId w:val="4"/>
   </w:num>
   <w:num w:numId="14" w16cid:durableId="1937441198">
-    <w:abstractNumId w:val="4"/>
+    <w:abstractNumId w:val="5"/>
   </w:num>
   <w:num w:numId="15" w16cid:durableId="1576478251">
     <w:abstractNumId w:val="2"/>
+  </w:num>
+  <w:num w:numId="16" w16cid:durableId="110561214">
+    <w:abstractNumId w:val="3"/>
+  </w:num>
+  <w:num w:numId="17" w16cid:durableId="617493295">
+    <w:abstractNumId w:val="10"/>
+  </w:num>
+  <w:num w:numId="18" w16cid:durableId="385178112">
+    <w:abstractNumId w:val="12"/>
+  </w:num>
+  <w:num w:numId="19" w16cid:durableId="1088035321">
+    <w:abstractNumId w:val="17"/>
+  </w:num>
+  <w:num w:numId="20" w16cid:durableId="838891783">
+    <w:abstractNumId w:val="6"/>
   </w:num>
 </w:numbering>
 </file>
@@ -10677,6 +12410,7 @@
   <w:style w:type="character" w:default="1" w:styleId="DefaultParagraphFont">
     <w:name w:val="Default Paragraph Font"/>
     <w:uiPriority w:val="1"/>
+    <w:semiHidden/>
     <w:unhideWhenUsed/>
   </w:style>
   <w:style w:type="table" w:default="1" w:styleId="TableNormal">

</xml_diff>